<commit_message>
docs: mark Realtime 3.1-3.3 + Polish 5.2-5.3 completed — 38/50 → 49/50 only Deploy 5.4 pending (pre-deploy bug fixes)
</commit_message>
<xml_diff>
--- a/Documents/FlowBoard_Tasks_Plan.docx
+++ b/Documents/FlowBoard_Tasks_Plan.docx
@@ -9875,7 +9875,7 @@
                 <w:color w:val="333333"/>
                 <w:sz w:val="13"/>
               </w:rPr>
-              <w:t>Pending</w:t>
+              <w:t>Completed</w:t>
             </w:r>
           </w:p>
         </w:tc>
@@ -10354,7 +10354,7 @@
                 <w:color w:val="333333"/>
                 <w:sz w:val="13"/>
               </w:rPr>
-              <w:t>Pending</w:t>
+              <w:t>Completed</w:t>
             </w:r>
           </w:p>
         </w:tc>
@@ -10833,7 +10833,7 @@
                 <w:color w:val="333333"/>
                 <w:sz w:val="13"/>
               </w:rPr>
-              <w:t>Pending</w:t>
+              <w:t>Completed</w:t>
             </w:r>
           </w:p>
         </w:tc>

</xml_diff>

<commit_message>
feat: Phase 11 perf + header flicker fix - BoardService batched counts + Sprints/Teams AsNoTracking + header wait for route + loader + TasksPlan Phase 11
</commit_message>
<xml_diff>
--- a/Documents/FlowBoard_Tasks_Plan.docx
+++ b/Documents/FlowBoard_Tasks_Plan.docx
@@ -17586,6 +17586,572 @@
       </w:tr>
     </w:tbl>
     <w:p/>
+    <w:p>
+      <w:pPr>
+        <w:pStyle w:val="Heading1"/>
+      </w:pPr>
+      <w:r>
+        <w:t>Phase 11: Production Performance &amp; Loader — MNC Grade (7 Tasks) — Post-Deploy 2026-09-17</w:t>
+      </w:r>
+    </w:p>
+    <w:p>
+      <w:r>
+        <w:t>Goal: Make every screen open instantly, APIs fast, and loader quiet. Each task is one focused change, verified in the browser before the next. Total 7 tasks, single commit at the end only after your approval.</w:t>
+      </w:r>
+    </w:p>
+    <w:p>
+      <w:pPr>
+        <w:pStyle w:val="Heading2"/>
+      </w:pPr>
+      <w:r>
+        <w:t>Task 11.1: Backend Reads Become Light</w:t>
+      </w:r>
+    </w:p>
+    <w:p>
+      <w:r>
+        <w:rPr>
+          <w:b/>
+        </w:rPr>
+        <w:t xml:space="preserve">Objective: </w:t>
+      </w:r>
+      <w:r>
+        <w:t>Make every list read cheap and paged.</w:t>
+      </w:r>
+    </w:p>
+    <w:p>
+      <w:r>
+        <w:rPr>
+          <w:b/>
+        </w:rPr>
+        <w:t xml:space="preserve">Key Actions: </w:t>
+      </w:r>
+      <w:r>
+        <w:t>Reads use read-only, select only needed fields, paging with enforced limits, filter/sort on DB, single set query, indexes on most filtered columns.</w:t>
+      </w:r>
+    </w:p>
+    <w:p>
+      <w:r>
+        <w:rPr>
+          <w:b/>
+        </w:rPr>
+        <w:t xml:space="preserve">Exit Criteria: </w:t>
+      </w:r>
+      <w:r>
+        <w:t>All list APIs return paged result, no per-row loops, indexes added, 200 OK</w:t>
+      </w:r>
+    </w:p>
+    <w:p>
+      <w:r>
+        <w:rPr>
+          <w:b/>
+        </w:rPr>
+        <w:t xml:space="preserve">Hours: </w:t>
+      </w:r>
+      <w:r>
+        <w:t>2h</w:t>
+      </w:r>
+    </w:p>
+    <w:p>
+      <w:r>
+        <w:rPr>
+          <w:b/>
+        </w:rPr>
+        <w:t xml:space="preserve">Deliverables: </w:t>
+      </w:r>
+      <w:r>
+        <w:t>Code change plus browser verification per task</w:t>
+      </w:r>
+    </w:p>
+    <w:p>
+      <w:r>
+        <w:rPr>
+          <w:b/>
+        </w:rPr>
+        <w:t xml:space="preserve">Dependencies: </w:t>
+      </w:r>
+      <w:r>
+        <w:t>Previous task in this phase</w:t>
+      </w:r>
+    </w:p>
+    <w:p>
+      <w:r>
+        <w:t>---</w:t>
+      </w:r>
+    </w:p>
+    <w:p>
+      <w:pPr>
+        <w:pStyle w:val="Heading2"/>
+      </w:pPr>
+      <w:r>
+        <w:t>Task 11.2: Shared Cache and Browser Cache</w:t>
+      </w:r>
+    </w:p>
+    <w:p>
+      <w:r>
+        <w:rPr>
+          <w:b/>
+        </w:rPr>
+        <w:t xml:space="preserve">Objective: </w:t>
+      </w:r>
+      <w:r>
+        <w:t>Repeat opens do not rebuild.</w:t>
+      </w:r>
+    </w:p>
+    <w:p>
+      <w:r>
+        <w:rPr>
+          <w:b/>
+        </w:rPr>
+        <w:t xml:space="preserve">Key Actions: </w:t>
+      </w:r>
+      <w:r>
+        <w:t>Boards/tasks in shared cache short time with precise invalidation on create/move, validator for not modified, connection pooling and compression.</w:t>
+      </w:r>
+    </w:p>
+    <w:p>
+      <w:r>
+        <w:rPr>
+          <w:b/>
+        </w:rPr>
+        <w:t xml:space="preserve">Exit Criteria: </w:t>
+      </w:r>
+      <w:r>
+        <w:t>Second open of same board hits cache, 304 where possible</w:t>
+      </w:r>
+    </w:p>
+    <w:p>
+      <w:r>
+        <w:rPr>
+          <w:b/>
+        </w:rPr>
+        <w:t xml:space="preserve">Hours: </w:t>
+      </w:r>
+      <w:r>
+        <w:t>1.5h</w:t>
+      </w:r>
+    </w:p>
+    <w:p>
+      <w:r>
+        <w:rPr>
+          <w:b/>
+        </w:rPr>
+        <w:t xml:space="preserve">Deliverables: </w:t>
+      </w:r>
+      <w:r>
+        <w:t>Code change plus browser verification per task</w:t>
+      </w:r>
+    </w:p>
+    <w:p>
+      <w:r>
+        <w:rPr>
+          <w:b/>
+        </w:rPr>
+        <w:t xml:space="preserve">Dependencies: </w:t>
+      </w:r>
+      <w:r>
+        <w:t>Previous task in this phase</w:t>
+      </w:r>
+    </w:p>
+    <w:p>
+      <w:r>
+        <w:t>---</w:t>
+      </w:r>
+    </w:p>
+    <w:p>
+      <w:pPr>
+        <w:pStyle w:val="Heading2"/>
+      </w:pPr>
+      <w:r>
+        <w:t>Task 11.3: One Shared Copy of User and Flags</w:t>
+      </w:r>
+    </w:p>
+    <w:p>
+      <w:r>
+        <w:rPr>
+          <w:b/>
+        </w:rPr>
+        <w:t xml:space="preserve">Objective: </w:t>
+      </w:r>
+      <w:r>
+        <w:t>Stop parallel frequent refetch.</w:t>
+      </w:r>
+    </w:p>
+    <w:p>
+      <w:r>
+        <w:rPr>
+          <w:b/>
+        </w:rPr>
+        <w:t xml:space="preserve">Key Actions: </w:t>
+      </w:r>
+      <w:r>
+        <w:t>Single shared copy long fresh time, no refetch on window focus, dedupe parallel, refresh only after relevant action.</w:t>
+      </w:r>
+    </w:p>
+    <w:p>
+      <w:r>
+        <w:rPr>
+          <w:b/>
+        </w:rPr>
+        <w:t xml:space="preserve">Exit Criteria: </w:t>
+      </w:r>
+      <w:r>
+        <w:t>One who-am-I and one flags request per session, silent refresh only on needed action</w:t>
+      </w:r>
+    </w:p>
+    <w:p>
+      <w:r>
+        <w:rPr>
+          <w:b/>
+        </w:rPr>
+        <w:t xml:space="preserve">Hours: </w:t>
+      </w:r>
+      <w:r>
+        <w:t>1h</w:t>
+      </w:r>
+    </w:p>
+    <w:p>
+      <w:r>
+        <w:rPr>
+          <w:b/>
+        </w:rPr>
+        <w:t xml:space="preserve">Deliverables: </w:t>
+      </w:r>
+      <w:r>
+        <w:t>Code change plus browser verification per task</w:t>
+      </w:r>
+    </w:p>
+    <w:p>
+      <w:r>
+        <w:rPr>
+          <w:b/>
+        </w:rPr>
+        <w:t xml:space="preserve">Dependencies: </w:t>
+      </w:r>
+      <w:r>
+        <w:t>Previous task in this phase</w:t>
+      </w:r>
+    </w:p>
+    <w:p>
+      <w:r>
+        <w:t>---</w:t>
+      </w:r>
+    </w:p>
+    <w:p>
+      <w:pPr>
+        <w:pStyle w:val="Heading2"/>
+      </w:pPr>
+      <w:r>
+        <w:t>Task 11.4: Loader Becomes Quiet</w:t>
+      </w:r>
+    </w:p>
+    <w:p>
+      <w:r>
+        <w:rPr>
+          <w:b/>
+        </w:rPr>
+        <w:t xml:space="preserve">Objective: </w:t>
+      </w:r>
+      <w:r>
+        <w:t>Loader shows only for user actions.</w:t>
+      </w:r>
+    </w:p>
+    <w:p>
+      <w:r>
+        <w:rPr>
+          <w:b/>
+        </w:rPr>
+        <w:t xml:space="preserve">Key Actions: </w:t>
+      </w:r>
+      <w:r>
+        <w:t>Mark quiet background checks silent, skeleton placeholders instead of full spinner.</w:t>
+      </w:r>
+    </w:p>
+    <w:p>
+      <w:r>
+        <w:rPr>
+          <w:b/>
+        </w:rPr>
+        <w:t xml:space="preserve">Exit Criteria: </w:t>
+      </w:r>
+      <w:r>
+        <w:t>No loader flicker while reading</w:t>
+      </w:r>
+    </w:p>
+    <w:p>
+      <w:r>
+        <w:rPr>
+          <w:b/>
+        </w:rPr>
+        <w:t xml:space="preserve">Hours: </w:t>
+      </w:r>
+      <w:r>
+        <w:t>1h</w:t>
+      </w:r>
+    </w:p>
+    <w:p>
+      <w:r>
+        <w:rPr>
+          <w:b/>
+        </w:rPr>
+        <w:t xml:space="preserve">Deliverables: </w:t>
+      </w:r>
+      <w:r>
+        <w:t>Code change plus browser verification per task</w:t>
+      </w:r>
+    </w:p>
+    <w:p>
+      <w:r>
+        <w:rPr>
+          <w:b/>
+        </w:rPr>
+        <w:t xml:space="preserve">Dependencies: </w:t>
+      </w:r>
+      <w:r>
+        <w:t>Previous task in this phase</w:t>
+      </w:r>
+    </w:p>
+    <w:p>
+      <w:r>
+        <w:t>---</w:t>
+      </w:r>
+    </w:p>
+    <w:p>
+      <w:pPr>
+        <w:pStyle w:val="Heading2"/>
+      </w:pPr>
+      <w:r>
+        <w:t>Task 11.5: Optimistic Board and Realtime</w:t>
+      </w:r>
+    </w:p>
+    <w:p>
+      <w:r>
+        <w:rPr>
+          <w:b/>
+        </w:rPr>
+        <w:t xml:space="preserve">Objective: </w:t>
+      </w:r>
+      <w:r>
+        <w:t>Drag feels instant.</w:t>
+      </w:r>
+    </w:p>
+    <w:p>
+      <w:r>
+        <w:rPr>
+          <w:b/>
+        </w:rPr>
+        <w:t xml:space="preserve">Key Actions: </w:t>
+      </w:r>
+      <w:r>
+        <w:t>Move card instantly, confirm in background, revert only on error, keep distributed lock, precise invalidation, realtime update others.</w:t>
+      </w:r>
+    </w:p>
+    <w:p>
+      <w:r>
+        <w:rPr>
+          <w:b/>
+        </w:rPr>
+        <w:t xml:space="preserve">Exit Criteria: </w:t>
+      </w:r>
+      <w:r>
+        <w:t>Drag settles instantly</w:t>
+      </w:r>
+    </w:p>
+    <w:p>
+      <w:r>
+        <w:rPr>
+          <w:b/>
+        </w:rPr>
+        <w:t xml:space="preserve">Hours: </w:t>
+      </w:r>
+      <w:r>
+        <w:t>1.5h</w:t>
+      </w:r>
+    </w:p>
+    <w:p>
+      <w:r>
+        <w:rPr>
+          <w:b/>
+        </w:rPr>
+        <w:t xml:space="preserve">Deliverables: </w:t>
+      </w:r>
+      <w:r>
+        <w:t>Code change plus browser verification per task</w:t>
+      </w:r>
+    </w:p>
+    <w:p>
+      <w:r>
+        <w:rPr>
+          <w:b/>
+        </w:rPr>
+        <w:t xml:space="preserve">Dependencies: </w:t>
+      </w:r>
+      <w:r>
+        <w:t>Previous task in this phase</w:t>
+      </w:r>
+    </w:p>
+    <w:p>
+      <w:r>
+        <w:t>---</w:t>
+      </w:r>
+    </w:p>
+    <w:p>
+      <w:pPr>
+        <w:pStyle w:val="Heading2"/>
+      </w:pPr>
+      <w:r>
+        <w:t>Task 11.6: Frontend Bundle Becomes Light</w:t>
+      </w:r>
+    </w:p>
+    <w:p>
+      <w:r>
+        <w:rPr>
+          <w:b/>
+        </w:rPr>
+        <w:t xml:space="preserve">Objective: </w:t>
+      </w:r>
+      <w:r>
+        <w:t>First paint fast.</w:t>
+      </w:r>
+    </w:p>
+    <w:p>
+      <w:r>
+        <w:rPr>
+          <w:b/>
+        </w:rPr>
+        <w:t xml:space="preserve">Key Actions: </w:t>
+      </w:r>
+      <w:r>
+        <w:t>Lazy chunks, preload project after login, charts only inside needs, row tracking, lazy images, debounce search.</w:t>
+      </w:r>
+    </w:p>
+    <w:p>
+      <w:r>
+        <w:rPr>
+          <w:b/>
+        </w:rPr>
+        <w:t xml:space="preserve">Exit Criteria: </w:t>
+      </w:r>
+      <w:r>
+        <w:t>Initial bundle smaller, search debounced</w:t>
+      </w:r>
+    </w:p>
+    <w:p>
+      <w:r>
+        <w:rPr>
+          <w:b/>
+        </w:rPr>
+        <w:t xml:space="preserve">Hours: </w:t>
+      </w:r>
+      <w:r>
+        <w:t>1.5h</w:t>
+      </w:r>
+    </w:p>
+    <w:p>
+      <w:r>
+        <w:rPr>
+          <w:b/>
+        </w:rPr>
+        <w:t xml:space="preserve">Deliverables: </w:t>
+      </w:r>
+      <w:r>
+        <w:t>Code change plus browser verification per task</w:t>
+      </w:r>
+    </w:p>
+    <w:p>
+      <w:r>
+        <w:rPr>
+          <w:b/>
+        </w:rPr>
+        <w:t xml:space="preserve">Dependencies: </w:t>
+      </w:r>
+      <w:r>
+        <w:t>Previous task in this phase</w:t>
+      </w:r>
+    </w:p>
+    <w:p>
+      <w:r>
+        <w:t>---</w:t>
+      </w:r>
+    </w:p>
+    <w:p>
+      <w:pPr>
+        <w:pStyle w:val="Heading2"/>
+      </w:pPr>
+      <w:r>
+        <w:t>Task 11.7: Verify With Metrics</w:t>
+      </w:r>
+    </w:p>
+    <w:p>
+      <w:r>
+        <w:rPr>
+          <w:b/>
+        </w:rPr>
+        <w:t xml:space="preserve">Objective: </w:t>
+      </w:r>
+      <w:r>
+        <w:t>Prove the gain.</w:t>
+      </w:r>
+    </w:p>
+    <w:p>
+      <w:r>
+        <w:rPr>
+          <w:b/>
+        </w:rPr>
+        <w:t xml:space="preserve">Key Actions: </w:t>
+      </w:r>
+      <w:r>
+        <w:t>Check payload, time to first paint, API latency, cache hit, loader count, before/after note.</w:t>
+      </w:r>
+    </w:p>
+    <w:p>
+      <w:r>
+        <w:rPr>
+          <w:b/>
+        </w:rPr>
+        <w:t xml:space="preserve">Exit Criteria: </w:t>
+      </w:r>
+      <w:r>
+        <w:t>Metrics recorded</w:t>
+      </w:r>
+    </w:p>
+    <w:p>
+      <w:r>
+        <w:rPr>
+          <w:b/>
+        </w:rPr>
+        <w:t xml:space="preserve">Hours: </w:t>
+      </w:r>
+      <w:r>
+        <w:t>1h</w:t>
+      </w:r>
+    </w:p>
+    <w:p>
+      <w:r>
+        <w:rPr>
+          <w:b/>
+        </w:rPr>
+        <w:t xml:space="preserve">Deliverables: </w:t>
+      </w:r>
+      <w:r>
+        <w:t>Code change plus browser verification per task</w:t>
+      </w:r>
+    </w:p>
+    <w:p>
+      <w:r>
+        <w:rPr>
+          <w:b/>
+        </w:rPr>
+        <w:t xml:space="preserve">Dependencies: </w:t>
+      </w:r>
+      <w:r>
+        <w:t>Previous task in this phase</w:t>
+      </w:r>
+    </w:p>
+    <w:p>
+      <w:r>
+        <w:t>---</w:t>
+      </w:r>
+    </w:p>
     <w:sectPr>
       <w:footerReference w:type="default" r:id="rId9"/>
       <w:pgSz w:w="12240" w:h="15840"/>

</xml_diff>

<commit_message>
fix: Task 12 refresh cross-site clean single cookie (Lax dev / None+Secure prod) + workspaces deduped me - no duplicate paths - 65/65
</commit_message>
<xml_diff>
--- a/Documents/FlowBoard_Tasks_Plan.docx
+++ b/Documents/FlowBoard_Tasks_Plan.docx
@@ -18145,6 +18145,192 @@
       </w:r>
       <w:r>
         <w:t>Previous task in this phase</w:t>
+      </w:r>
+    </w:p>
+    <w:p>
+      <w:r>
+        <w:t>---</w:t>
+      </w:r>
+    </w:p>
+    <w:p/>
+    <w:p>
+      <w:r>
+        <w:rPr>
+          <w:b/>
+        </w:rPr>
+        <w:t>Phase 12: Post-Deploy Auth Stability — Refresh Cookie Cross-Site &amp; Single Refresh Lock (MNC Grade) — Post-Deploy 2026-09-17</w:t>
+      </w:r>
+    </w:p>
+    <w:p>
+      <w:r>
+        <w:t>Goal: Fix Refresh token missing 401 after create workspace/update/delete and on reload. Make refresh work cross-site (Vercel -&gt; MonsterASP) with env-aware cookie (Lax dev / None+Secure prod) single root cookie, gateway allows credentials, frontend single shared session with deduped refresh queue, no per-entity fix needed. Verified live with create workspace then reload stays logged in, no spurious refresh 401.</w:t>
+      </w:r>
+    </w:p>
+    <w:p>
+      <w:r>
+        <w:rPr>
+          <w:b/>
+        </w:rPr>
+        <w:t>Task 12.1: Backend Refresh Cookie Becomes Cross-Site Aware</w:t>
+      </w:r>
+    </w:p>
+    <w:p>
+      <w:r>
+        <w:t>Objective: One refresh cookie works in both dev and prod, no duplicate.</w:t>
+      </w:r>
+    </w:p>
+    <w:p>
+      <w:r>
+        <w:t>Key Actions: Set cookie HttpOnly Secure with SameSite Lax in Development and None in Production, Path /, 7 days, single cookie, clear duplicate on auth path, forward through gateway, do not create two cookies.</w:t>
+      </w:r>
+    </w:p>
+    <w:p>
+      <w:r>
+        <w:t>Exit Criteria: Login sets one refreshToken cookie Lax dev / None prod, refresh POST sends cookie cross-site 200, no Refresh token missing</w:t>
+      </w:r>
+    </w:p>
+    <w:p>
+      <w:r>
+        <w:t>Hours: 1h</w:t>
+      </w:r>
+    </w:p>
+    <w:p>
+      <w:r>
+        <w:t>Deliverables: Code change plus browser verification per task</w:t>
+      </w:r>
+    </w:p>
+    <w:p>
+      <w:r>
+        <w:t>Dependencies: Previous task in this phase</w:t>
+      </w:r>
+    </w:p>
+    <w:p>
+      <w:r>
+        <w:t>---</w:t>
+      </w:r>
+    </w:p>
+    <w:p>
+      <w:r>
+        <w:rPr>
+          <w:b/>
+        </w:rPr>
+        <w:t>Task 12.2: Gateway Allows Credentials Cross-Site</w:t>
+      </w:r>
+    </w:p>
+    <w:p>
+      <w:r>
+        <w:t>Objective: Browser is allowed to send cookies cross-site.</w:t>
+      </w:r>
+    </w:p>
+    <w:p>
+      <w:r>
+        <w:t>Key Actions: Enable CORS allow credentials for Vercel domains, expose Set-Cookie, forward Cookie header, keep YARP Order correct.</w:t>
+      </w:r>
+    </w:p>
+    <w:p>
+      <w:r>
+        <w:t>Exit Criteria: Preflight allows credentials, Set-Cookie visible, refresh sends Cookie header</w:t>
+      </w:r>
+    </w:p>
+    <w:p>
+      <w:r>
+        <w:t>Hours: 0.5h</w:t>
+      </w:r>
+    </w:p>
+    <w:p>
+      <w:r>
+        <w:t>Deliverables: Code change plus browser verification per task</w:t>
+      </w:r>
+    </w:p>
+    <w:p>
+      <w:r>
+        <w:t>Dependencies: Previous task in this phase</w:t>
+      </w:r>
+    </w:p>
+    <w:p>
+      <w:r>
+        <w:t>---</w:t>
+      </w:r>
+    </w:p>
+    <w:p>
+      <w:r>
+        <w:rPr>
+          <w:b/>
+        </w:rPr>
+        <w:t>Task 12.3: Frontend Single Refresh Lock and Queue</w:t>
+      </w:r>
+    </w:p>
+    <w:p>
+      <w:r>
+        <w:t>Objective: Parallel 401s cause one refresh, not many.</w:t>
+      </w:r>
+    </w:p>
+    <w:p>
+      <w:r>
+        <w:t>Key Actions: Interceptor queues failed requests behind one refresh, withCredentials for refresh, dedup parallel, replay on success, logout only on definitive failure.</w:t>
+      </w:r>
+    </w:p>
+    <w:p>
+      <w:r>
+        <w:t>Exit Criteria: Create workspace fires one refresh at most, no duplicate 401, reload stays logged in</w:t>
+      </w:r>
+    </w:p>
+    <w:p>
+      <w:r>
+        <w:t>Hours: 1h</w:t>
+      </w:r>
+    </w:p>
+    <w:p>
+      <w:r>
+        <w:t>Deliverables: Code change plus browser verification per task</w:t>
+      </w:r>
+    </w:p>
+    <w:p>
+      <w:r>
+        <w:t>Dependencies: Previous task in this phase</w:t>
+      </w:r>
+    </w:p>
+    <w:p>
+      <w:r>
+        <w:t>---</w:t>
+      </w:r>
+    </w:p>
+    <w:p>
+      <w:r>
+        <w:rPr>
+          <w:b/>
+        </w:rPr>
+        <w:t>Task 12.4: Frontend Single Shared Session</w:t>
+      </w:r>
+    </w:p>
+    <w:p>
+      <w:r>
+        <w:t>Objective: One who-am-I and one flags per session, silent.</w:t>
+      </w:r>
+    </w:p>
+    <w:p>
+      <w:r>
+        <w:t>Key Actions: TanStack staleTime 5m, no window focus refetch, single shared me observable, silent X-Silent for maintenance/flags, invalidate only after relevant action.</w:t>
+      </w:r>
+    </w:p>
+    <w:p>
+      <w:r>
+        <w:t>Exit Criteria: One me and one flags per session, no burst after create/update/delete</w:t>
+      </w:r>
+    </w:p>
+    <w:p>
+      <w:r>
+        <w:t>Hours: 0.5h</w:t>
+      </w:r>
+    </w:p>
+    <w:p>
+      <w:r>
+        <w:t>Deliverables: Code change plus browser verification per task</w:t>
+      </w:r>
+    </w:p>
+    <w:p>
+      <w:r>
+        <w:t>Dependencies: Previous task in this phase</w:t>
       </w:r>
     </w:p>
     <w:p>

</xml_diff>

<commit_message>
fix: frontend build errors in global projects member filter (visiblePages computed, editing null guard, async effect inner IIFE)
</commit_message>
<xml_diff>
--- a/Documents/FlowBoard_Tasks_Plan.docx
+++ b/Documents/FlowBoard_Tasks_Plan.docx
@@ -18336,6 +18336,2791 @@
     <w:p>
       <w:r>
         <w:t>---</w:t>
+      </w:r>
+    </w:p>
+    <w:p/>
+    <w:p>
+      <w:r>
+        <w:rPr>
+          <w:b/>
+        </w:rPr>
+        <w:t>Phase 13: OrgAdmin Bypass Everywhere + Permission-Aware UI (All 35 Permissions Hidden Where Not Allowed) — Post-Deploy 2026-09-17</w:t>
+      </w:r>
+    </w:p>
+    <w:p>
+      <w:r>
+        <w:t>Goal: OrgAdmin with zero WorkspaceMembers can act on any workspace (project, board, list, status, task, comment, attachment) via single org-aware bypass, and every write button plus view gate is hidden or disabled exactly where the matching permission is missing. Custom roles start empty, OrgAdmin ticks permissions in role manage, members see only what was granted. All 35 permissions from [identity].[Permissions] are mapped to their page and button. Total 8 tasks, one focused change per surface, verified in incognito after each.</w:t>
+      </w:r>
+    </w:p>
+    <w:p/>
+    <w:p>
+      <w:r>
+        <w:rPr>
+          <w:b/>
+        </w:rPr>
+        <w:t>Task 13.1: Backend Single OrgAdmin Bypass Everywhere</w:t>
+      </w:r>
+    </w:p>
+    <w:p>
+      <w:r>
+        <w:t>Objective: OrgAdmin (OrganizationMembers Role=2) and SuperAdmin bypass all workspace scoped checks even with zero WorkspaceMembers.</w:t>
+      </w:r>
+    </w:p>
+    <w:p>
+      <w:r>
+        <w:t>Key Actions: Create shared helper IsOrgAdminInOrgAsync + IsSuperAdmin, place at top of every workspace scoped write before workspace row or custom role check. Surfaces: project:create/update/delete, board:create/update/delete, workspace:create/update/delete, status:create/update/delete, task:create/update/delete/move/assign, comment:create, attachment:create/update/delete, role:manage/view, activity:view. If OrgAdmin or SuperAdmin allow immediately, else fall back to WorkspaceMember + CustomRoleId + RolePermissions join. No per entity duplication.</w:t>
+      </w:r>
+    </w:p>
+    <w:p>
+      <w:r>
+        <w:t>Exit Criteria: Logged in as OrgAdmin in incognito can create project in Marketing, create board, create status, create task, move task, comment, upload attachment in any workspace even with zero workspace rows. Member without permission still 403.</w:t>
+      </w:r>
+    </w:p>
+    <w:p>
+      <w:r>
+        <w:t>Hours: 2h</w:t>
+      </w:r>
+    </w:p>
+    <w:p>
+      <w:r>
+        <w:t>Deliverables: Shared bypass helper + updated services + incognito verification per surface</w:t>
+      </w:r>
+    </w:p>
+    <w:p>
+      <w:r>
+        <w:t>Dependencies: Previous task in this phase</w:t>
+      </w:r>
+    </w:p>
+    <w:p>
+      <w:r>
+        <w:t>Permission Map: All 35 keys are affected by this bypass as first gate, then specific key is checked for members.</w:t>
+      </w:r>
+    </w:p>
+    <w:p>
+      <w:r>
+        <w:t>---</w:t>
+      </w:r>
+    </w:p>
+    <w:p>
+      <w:r>
+        <w:rPr>
+          <w:b/>
+        </w:rPr>
+        <w:t>Task 13.2: Frontend Single Permission Source and Helper</w:t>
+      </w:r>
+    </w:p>
+    <w:p>
+      <w:r>
+        <w:t>Objective: One who-am-I cached profile is the single source for all can checks, no scattered permission calls.</w:t>
+      </w:r>
+    </w:p>
+    <w:p>
+      <w:r>
+        <w:t>Key Actions: Use deduped me with 5m stale, expose hasPermission(workspaceId, key) and canCreateProject(team/workspace) helpers that first check isOrgAdmin or isSuperAdmin then check permissions array from me. No window focus refetch, no polling. Invalidate only after role save or promotion.</w:t>
+      </w:r>
+    </w:p>
+    <w:p>
+      <w:r>
+        <w:t>Exit Criteria: One me per session, any component can call hasPermission and gets correct result for OrgAdmin vs custom role without extra API.</w:t>
+      </w:r>
+    </w:p>
+    <w:p>
+      <w:r>
+        <w:t>Hours: 0.5h</w:t>
+      </w:r>
+    </w:p>
+    <w:p>
+      <w:r>
+        <w:t>Deliverables: Central helper + TanStack config</w:t>
+      </w:r>
+    </w:p>
+    <w:p>
+      <w:r>
+        <w:t>Dependencies: Previous task in this phase</w:t>
+      </w:r>
+    </w:p>
+    <w:p>
+      <w:r>
+        <w:t>Permission Map: Helper serves all 35 keys.</w:t>
+      </w:r>
+    </w:p>
+    <w:p>
+      <w:r>
+        <w:t>---</w:t>
+      </w:r>
+    </w:p>
+    <w:p>
+      <w:r>
+        <w:rPr>
+          <w:b/>
+        </w:rPr>
+        <w:t>Task 13.3: Organization and Workspace Surfaces</w:t>
+      </w:r>
+    </w:p>
+    <w:p>
+      <w:r>
+        <w:t>Objective: Hide or disable organization and workspace actions where permission missing.</w:t>
+      </w:r>
+    </w:p>
+    <w:p>
+      <w:r>
+        <w:t>Key Actions: Pages: Organization settings, Organization Activity, Workspaces list. Buttons and gates: org:view hides org name and member list, org:update disables edit org dialog, org:delete hides delete org, workspace:view hides workspace list and board access, workspace:create hides New Workspace button on Workspaces page and inside org, workspace:update disables rename workspace, workspace:delete hides delete workspace, role:view hides Custom Roles list, role:manage hides Create Role and tick save. Show disabled with tooltip You do not have permission when not allowed but user can see page.</w:t>
+      </w:r>
+    </w:p>
+    <w:p>
+      <w:r>
+        <w:t>Exit Criteria: Member without workspace:create never sees New Workspace, OrgAdmin sees it everywhere. Viewer sees list but no edit or delete.</w:t>
+      </w:r>
+    </w:p>
+    <w:p>
+      <w:r>
+        <w:t>Hours: 1h</w:t>
+      </w:r>
+    </w:p>
+    <w:p>
+      <w:r>
+        <w:t>Deliverables: Org/Workspace pages with hidden where not allowed</w:t>
+      </w:r>
+    </w:p>
+    <w:p>
+      <w:r>
+        <w:t>Dependencies: Previous task in this phase</w:t>
+      </w:r>
+    </w:p>
+    <w:p>
+      <w:r>
+        <w:t>Permission Map: org:view, org:update, org:delete, workspace:view, workspace:create, workspace:update, workspace:delete, role:view, role:manage (8 keys)</w:t>
+      </w:r>
+    </w:p>
+    <w:p>
+      <w:r>
+        <w:t>---</w:t>
+      </w:r>
+    </w:p>
+    <w:p>
+      <w:r>
+        <w:rPr>
+          <w:b/>
+        </w:rPr>
+        <w:t>Task 13.4: Project Surface</w:t>
+      </w:r>
+    </w:p>
+    <w:p>
+      <w:r>
+        <w:t>Objective: Hide project actions where permission missing.</w:t>
+      </w:r>
+    </w:p>
+    <w:p>
+      <w:r>
+        <w:t>Key Actions: Pages: Projects list inside workspace and global projects. Buttons: project:view hides project cards and nav entry, project:create hides New Project button and modal submit, project:update disables rename project, project:delete hides delete project in settings. OrgAdmin bypass ensures OrgAdmin always sees create even with zero rows.</w:t>
+      </w:r>
+    </w:p>
+    <w:p>
+      <w:r>
+        <w:t>Exit Criteria: Your incognito OrgAdmin now sees and can create Campaign 1 in Marketing without 403, Member without project:create never sees New Project.</w:t>
+      </w:r>
+    </w:p>
+    <w:p>
+      <w:r>
+        <w:t>Hours: 0.5h</w:t>
+      </w:r>
+    </w:p>
+    <w:p>
+      <w:r>
+        <w:t>Deliverables: Projects pages hidden where not allowed</w:t>
+      </w:r>
+    </w:p>
+    <w:p>
+      <w:r>
+        <w:t>Dependencies: Previous task in this phase</w:t>
+      </w:r>
+    </w:p>
+    <w:p>
+      <w:r>
+        <w:t>Permission Map: project:view, project:create, project:update, project:delete (4 keys)</w:t>
+      </w:r>
+    </w:p>
+    <w:p>
+      <w:r>
+        <w:t>---</w:t>
+      </w:r>
+    </w:p>
+    <w:p>
+      <w:r>
+        <w:rPr>
+          <w:b/>
+        </w:rPr>
+        <w:t>Task 13.5: Board, List and Status Surfaces</w:t>
+      </w:r>
+    </w:p>
+    <w:p>
+      <w:r>
+        <w:t>Objective: Hide board and status configuration where permission missing.</w:t>
+      </w:r>
+    </w:p>
+    <w:p>
+      <w:r>
+        <w:t>Key Actions: Pages: Boards inside project, Board settings, Statuses in Project Settings. Buttons: board:view hides boards tab, board:create hides New Board, board:update disables rename board and column settings, board:delete hides delete board, status:view hides statuses section, status:create hides New Status, status:update disables rename status, status:delete hides delete status. Checks are per workspace and per project as status belongs to project.</w:t>
+      </w:r>
+    </w:p>
+    <w:p>
+      <w:r>
+        <w:t>Exit Criteria: Member without board:create never sees New Board, without status:view never sees statuses section.</w:t>
+      </w:r>
+    </w:p>
+    <w:p>
+      <w:r>
+        <w:t>Hours: 1h</w:t>
+      </w:r>
+    </w:p>
+    <w:p>
+      <w:r>
+        <w:t>Deliverables: Boards and statuses with hidden where not allowed</w:t>
+      </w:r>
+    </w:p>
+    <w:p>
+      <w:r>
+        <w:t>Dependencies: Previous task in this phase</w:t>
+      </w:r>
+    </w:p>
+    <w:p>
+      <w:r>
+        <w:t>Permission Map: board:view, board:create, board:update, board:delete, status:view, status:create, status:update, status:delete (8 keys)</w:t>
+      </w:r>
+    </w:p>
+    <w:p>
+      <w:r>
+        <w:t>---</w:t>
+      </w:r>
+    </w:p>
+    <w:p>
+      <w:r>
+        <w:rPr>
+          <w:b/>
+        </w:rPr>
+        <w:t>Task 13.6: Task, Comment, Attachment and Assignment Surfaces</w:t>
+      </w:r>
+    </w:p>
+    <w:p>
+      <w:r>
+        <w:t>Objective: Hide issue workflow where permission missing.</w:t>
+      </w:r>
+    </w:p>
+    <w:p>
+      <w:r>
+        <w:t>Key Actions: Pages: Issues list, Backlog, Board cards, Task detail modal. Buttons: task:view hides issues list and board cards, task:create hides New Task and Create Issue submit, task:update disables edit title description priority inside detail, task:delete hides delete task, task:move disables drag and move dropdown, task:assign hides assignee picker, comment:view hides comments thread, comment:create hides Add Comment, attachment:view hides attachments section, attachment:create hides Upload button, attachment:update disables rename, attachment:delete hides delete attachment.</w:t>
+      </w:r>
+    </w:p>
+    <w:p>
+      <w:r>
+        <w:t>Exit Criteria: Member without task:create never sees New Task, without task:move cannot drag, without comment:create cannot comment. OrgAdmin can do all even with zero rows.</w:t>
+      </w:r>
+    </w:p>
+    <w:p>
+      <w:r>
+        <w:t>Hours: 1.5h</w:t>
+      </w:r>
+    </w:p>
+    <w:p>
+      <w:r>
+        <w:t>Deliverables: Task detail and board with hidden where not allowed</w:t>
+      </w:r>
+    </w:p>
+    <w:p>
+      <w:r>
+        <w:t>Dependencies: Previous task in this phase</w:t>
+      </w:r>
+    </w:p>
+    <w:p>
+      <w:r>
+        <w:t>Permission Map: task:view, task:create, task:update, task:delete, task:move, task:assign, comment:view, comment:create, attachment:view, attachment:create, attachment:update, attachment:delete (12 keys)</w:t>
+      </w:r>
+    </w:p>
+    <w:p>
+      <w:r>
+        <w:t>---</w:t>
+      </w:r>
+    </w:p>
+    <w:p>
+      <w:r>
+        <w:rPr>
+          <w:b/>
+        </w:rPr>
+        <w:t>Task 13.7: Activity Surfaces</w:t>
+      </w:r>
+    </w:p>
+    <w:p>
+      <w:r>
+        <w:t>Objective: Hide audit and timeline where permission missing.</w:t>
+      </w:r>
+    </w:p>
+    <w:p>
+      <w:r>
+        <w:t>Key Actions: Pages: Organization Activity timeline and Project Activity timeline. Gates: activity:view:org hides org activity tab, activity:view:project hides project activity tab. Backend still enforces view check.</w:t>
+      </w:r>
+    </w:p>
+    <w:p>
+      <w:r>
+        <w:t>Exit Criteria: Member without activity:view:org never sees org activity, without activity:view:project never sees project activity.</w:t>
+      </w:r>
+    </w:p>
+    <w:p>
+      <w:r>
+        <w:t>Hours: 0.5h</w:t>
+      </w:r>
+    </w:p>
+    <w:p>
+      <w:r>
+        <w:t>Deliverables: Activity tabs hidden where not allowed</w:t>
+      </w:r>
+    </w:p>
+    <w:p>
+      <w:r>
+        <w:t>Dependencies: Previous task in this phase</w:t>
+      </w:r>
+    </w:p>
+    <w:p>
+      <w:r>
+        <w:t>Permission Map: activity:view:org, activity:view:project (2 keys)</w:t>
+      </w:r>
+    </w:p>
+    <w:p>
+      <w:r>
+        <w:t>---</w:t>
+      </w:r>
+    </w:p>
+    <w:p>
+      <w:r>
+        <w:rPr>
+          <w:b/>
+        </w:rPr>
+        <w:t>Task 13.8: Verify All 35 Permissions End to End</w:t>
+      </w:r>
+    </w:p>
+    <w:p>
+      <w:r>
+        <w:t>Objective: Prove every button that should be hidden is hidden and every bypass works.</w:t>
+      </w:r>
+    </w:p>
+    <w:p>
+      <w:r>
+        <w:t>Key Actions: In incognito test as OrgAdmin creates workspace then project then board then status then task then move then comment then attachment then activity. Then test as Member with custom Viewer role with only view keys and confirm create buttons are not visible and direct API still 403. Record before and after per surface.</w:t>
+      </w:r>
+    </w:p>
+    <w:p>
+      <w:r>
+        <w:t>Exit Criteria: All 35 keys mapped and verified, no spurious 403 toast for allowed actions, no hidden button visible for disallowed.</w:t>
+      </w:r>
+    </w:p>
+    <w:p>
+      <w:r>
+        <w:t>Hours: 1h</w:t>
+      </w:r>
+    </w:p>
+    <w:p>
+      <w:r>
+        <w:t>Deliverables: Verification matrix for all 35 permissions</w:t>
+      </w:r>
+    </w:p>
+    <w:p>
+      <w:r>
+        <w:t>Dependencies: Previous task in this phase</w:t>
+      </w:r>
+    </w:p>
+    <w:p>
+      <w:r>
+        <w:t>Permission Map: All 35 keys final check.</w:t>
+      </w:r>
+    </w:p>
+    <w:p>
+      <w:r>
+        <w:t>---</w:t>
+      </w:r>
+    </w:p>
+    <w:p>
+      <w:r>
+        <w:br w:type="page"/>
+      </w:r>
+    </w:p>
+    <w:p>
+      <w:pPr>
+        <w:pStyle w:val="Heading1"/>
+      </w:pPr>
+      <w:r>
+        <w:t>Phase 14: Frontend Permission-Aware UI Everywhere — Hide Every Button Where Permission Missing (All 35 Keys)</w:t>
+      </w:r>
+    </w:p>
+    <w:p>
+      <w:r>
+        <w:rPr>
+          <w:b/>
+        </w:rPr>
+        <w:t xml:space="preserve">Goal: </w:t>
+      </w:r>
+      <w:r>
+        <w:t>Every button that maps to a permission key is hidden or disabled via the single hasPermission helper (me 5m dedup, isOrgAdmin/isSuperAdmin bypass first, then permissions[] from me). No write button is visible when its key is missing, no view gate shows its section when view is missing. Backend remains enforcer (403), frontend prevents the click. Visible disabled buttons show tooltip "You do not have permission". Custom roles start empty, OrgAdmin ticks permissions, members see exactly what was granted. All 35 keys from [identity].[Permissions] are mapped to their page, screen and button.</w:t>
+      </w:r>
+    </w:p>
+    <w:p>
+      <w:r>
+        <w:rPr>
+          <w:i/>
+        </w:rPr>
+        <w:t>Note: This phase fixes the global Projects sidebar page and every create issue, board, status, task, comment, attachment and activity surface that was still using only isOrgAdmin or was ungated. It replaces hard-coded "board:create" strings with PermissionKeys constants and uses hasPermissionSync(workspaceId, key) as the single source. Total 8 tasks, one focused surface per task, verified in incognito (OrgAdmin vs Viewer) after each.</w:t>
+      </w:r>
+    </w:p>
+    <w:p>
+      <w:pPr>
+        <w:pStyle w:val="Heading2"/>
+      </w:pPr>
+      <w:r>
+        <w:t>Task 14.1: Organization Surfaces (org:view/update/delete — 3 keys)</w:t>
+      </w:r>
+    </w:p>
+    <w:p>
+      <w:r>
+        <w:rPr>
+          <w:b/>
+        </w:rPr>
+        <w:t xml:space="preserve">Objective: </w:t>
+      </w:r>
+      <w:r>
+        <w:t>Hides organization name and members list, disables edit organization dialog, hides delete organization where permission missing. Org view gate hides the whole organization section.</w:t>
+      </w:r>
+    </w:p>
+    <w:p>
+      <w:r>
+        <w:rPr>
+          <w:b/>
+        </w:rPr>
+        <w:t xml:space="preserve">Key Actions: </w:t>
+      </w:r>
+      <w:r>
+        <w:t>Pages: Organization settings / Organization header in workspaces and members. Screens: Organization header, members list. Buttons: Edit Org (org:update disabled), Delete Org (org:delete hidden).</w:t>
+      </w:r>
+    </w:p>
+    <w:p>
+      <w:r>
+        <w:rPr>
+          <w:b/>
+        </w:rPr>
+        <w:t xml:space="preserve">Exit Criteria: </w:t>
+      </w:r>
+      <w:r>
+        <w:t>Member without org:view never sees org name/members, OrgAdmin sees and can edit/delete in any org.</w:t>
+      </w:r>
+    </w:p>
+    <w:p>
+      <w:r>
+        <w:rPr>
+          <w:b/>
+        </w:rPr>
+        <w:t xml:space="preserve">Hours: </w:t>
+      </w:r>
+      <w:r>
+        <w:t>0.5h</w:t>
+      </w:r>
+    </w:p>
+    <w:p>
+      <w:r>
+        <w:rPr>
+          <w:b/>
+        </w:rPr>
+        <w:t xml:space="preserve">Deliverables: </w:t>
+      </w:r>
+      <w:r>
+        <w:t>Shared PermissionKeys + hasPermissionSync</w:t>
+      </w:r>
+    </w:p>
+    <w:p>
+      <w:r>
+        <w:rPr>
+          <w:b/>
+        </w:rPr>
+        <w:t xml:space="preserve">Dependencies: </w:t>
+      </w:r>
+      <w:r>
+        <w:t>Previous task in this phase</w:t>
+      </w:r>
+    </w:p>
+    <w:p>
+      <w:r>
+        <w:rPr>
+          <w:b/>
+        </w:rPr>
+        <w:t xml:space="preserve">Permission Map: </w:t>
+      </w:r>
+      <w:r>
+        <w:t>org:view/update/delete — 3 keys</w:t>
+      </w:r>
+    </w:p>
+    <w:p>
+      <w:pPr>
+        <w:pStyle w:val="Heading2"/>
+      </w:pPr>
+      <w:r>
+        <w:t>Task 14.2: Workspaces Surfaces (workspace:view/create/update/delete — 4 keys)</w:t>
+      </w:r>
+    </w:p>
+    <w:p>
+      <w:r>
+        <w:rPr>
+          <w:b/>
+        </w:rPr>
+        <w:t xml:space="preserve">Objective: </w:t>
+      </w:r>
+      <w:r>
+        <w:t>Hides workspace list, board access, new workspace, rename and delete where permission missing.</w:t>
+      </w:r>
+    </w:p>
+    <w:p>
+      <w:r>
+        <w:rPr>
+          <w:b/>
+        </w:rPr>
+        <w:t xml:space="preserve">Key Actions: </w:t>
+      </w:r>
+      <w:r>
+        <w:t>Pages: Workspaces list (global). Screens: Workspace cards grid. Buttons: New Workspace (workspace:create hidden), Open Workspace (workspace:view hidden/disabled), Edit/rename (workspace:update disabled with tooltip), Delete workspace (workspace:delete hidden).</w:t>
+      </w:r>
+    </w:p>
+    <w:p>
+      <w:r>
+        <w:rPr>
+          <w:b/>
+        </w:rPr>
+        <w:t xml:space="preserve">Exit Criteria: </w:t>
+      </w:r>
+      <w:r>
+        <w:t>Member without workspace:create never sees New Workspace, without workspace:view never sees cards or Open, without workspace:update sees View only instead of Edit.</w:t>
+      </w:r>
+    </w:p>
+    <w:p>
+      <w:r>
+        <w:rPr>
+          <w:b/>
+        </w:rPr>
+        <w:t xml:space="preserve">Hours: </w:t>
+      </w:r>
+      <w:r>
+        <w:t>1h</w:t>
+      </w:r>
+    </w:p>
+    <w:p>
+      <w:r>
+        <w:rPr>
+          <w:b/>
+        </w:rPr>
+        <w:t xml:space="preserve">Deliverables: </w:t>
+      </w:r>
+      <w:r>
+        <w:t>Workspaces list, cards, dropdown, Open button</w:t>
+      </w:r>
+    </w:p>
+    <w:p>
+      <w:r>
+        <w:rPr>
+          <w:b/>
+        </w:rPr>
+        <w:t xml:space="preserve">Dependencies: </w:t>
+      </w:r>
+      <w:r>
+        <w:t>Previous task in this phase</w:t>
+      </w:r>
+    </w:p>
+    <w:p>
+      <w:r>
+        <w:rPr>
+          <w:b/>
+        </w:rPr>
+        <w:t xml:space="preserve">Permission Map: </w:t>
+      </w:r>
+      <w:r>
+        <w:t>workspace:view/create/update/delete — 4 keys</w:t>
+      </w:r>
+    </w:p>
+    <w:p>
+      <w:pPr>
+        <w:pStyle w:val="Heading2"/>
+      </w:pPr>
+      <w:r>
+        <w:t>Task 14.3: Projects Surfaces — Per-Workspace and Global (project:view/create/update/delete — 4 keys)</w:t>
+      </w:r>
+    </w:p>
+    <w:p>
+      <w:r>
+        <w:rPr>
+          <w:b/>
+        </w:rPr>
+        <w:t xml:space="preserve">Objective: </w:t>
+      </w:r>
+      <w:r>
+        <w:t>Fixes both the projects inside /w/:wid and the separate global Projects page in the organization sidebar menu that was still using canCreateProjectEffective for all actions and hard-coded 'project:create'.</w:t>
+      </w:r>
+    </w:p>
+    <w:p>
+      <w:r>
+        <w:rPr>
+          <w:b/>
+        </w:rPr>
+        <w:t xml:space="preserve">Key Actions: </w:t>
+      </w:r>
+      <w:r>
+        <w:t>Pages: /w/:wid projects and /projects global. Screens: Project cards. Buttons: New Project (project:create hidden), project cards and Open Boards (project:view hidden), Edit project (project:update disabled), Delete project (project:delete hidden).</w:t>
+      </w:r>
+    </w:p>
+    <w:p>
+      <w:r>
+        <w:rPr>
+          <w:b/>
+        </w:rPr>
+        <w:t xml:space="preserve">Exit Criteria: </w:t>
+      </w:r>
+      <w:r>
+        <w:t>Global Projects now checks per project.workspaceId via hasPermissionSync(project.workspaceId, key); member without project:create never sees New Project, without project:view never sees cards.</w:t>
+      </w:r>
+    </w:p>
+    <w:p>
+      <w:r>
+        <w:rPr>
+          <w:b/>
+        </w:rPr>
+        <w:t xml:space="preserve">Hours: </w:t>
+      </w:r>
+      <w:r>
+        <w:t>1h</w:t>
+      </w:r>
+    </w:p>
+    <w:p>
+      <w:r>
+        <w:rPr>
+          <w:b/>
+        </w:rPr>
+        <w:t xml:space="preserve">Deliverables: </w:t>
+      </w:r>
+      <w:r>
+        <w:t>Both projects pages, modals</w:t>
+      </w:r>
+    </w:p>
+    <w:p>
+      <w:r>
+        <w:rPr>
+          <w:b/>
+        </w:rPr>
+        <w:t xml:space="preserve">Dependencies: </w:t>
+      </w:r>
+      <w:r>
+        <w:t>Previous task in this phase</w:t>
+      </w:r>
+    </w:p>
+    <w:p>
+      <w:r>
+        <w:rPr>
+          <w:b/>
+        </w:rPr>
+        <w:t xml:space="preserve">Permission Map: </w:t>
+      </w:r>
+      <w:r>
+        <w:t>project:view/create/update/delete — 4 keys</w:t>
+      </w:r>
+    </w:p>
+    <w:p>
+      <w:pPr>
+        <w:pStyle w:val="Heading2"/>
+      </w:pPr>
+      <w:r>
+        <w:t>Task 14.4: Boards Surfaces (board:view/create/update/delete — 4 keys)</w:t>
+      </w:r>
+    </w:p>
+    <w:p>
+      <w:r>
+        <w:rPr>
+          <w:b/>
+        </w:rPr>
+        <w:t xml:space="preserve">Objective: </w:t>
+      </w:r>
+      <w:r>
+        <w:t>Hides boards tab and board configuration where permission missing.</w:t>
+      </w:r>
+    </w:p>
+    <w:p>
+      <w:r>
+        <w:rPr>
+          <w:b/>
+        </w:rPr>
+        <w:t xml:space="preserve">Key Actions: </w:t>
+      </w:r>
+      <w:r>
+        <w:t>Pages: Boards inside project, Board settings. Screens: Boards grid. Buttons: Boards tab (board:view hidden), New Board (board:create hidden), rename board/column settings (board:update disabled), delete board (board:delete hidden).</w:t>
+      </w:r>
+    </w:p>
+    <w:p>
+      <w:r>
+        <w:rPr>
+          <w:b/>
+        </w:rPr>
+        <w:t xml:space="preserve">Exit Criteria: </w:t>
+      </w:r>
+      <w:r>
+        <w:t>Member without board:create never sees New Board, without board:view never sees boards tab or grid.</w:t>
+      </w:r>
+    </w:p>
+    <w:p>
+      <w:r>
+        <w:rPr>
+          <w:b/>
+        </w:rPr>
+        <w:t xml:space="preserve">Hours: </w:t>
+      </w:r>
+      <w:r>
+        <w:t>0.5h</w:t>
+      </w:r>
+    </w:p>
+    <w:p>
+      <w:r>
+        <w:rPr>
+          <w:b/>
+        </w:rPr>
+        <w:t xml:space="preserve">Deliverables: </w:t>
+      </w:r>
+      <w:r>
+        <w:t>Boards grid, modals</w:t>
+      </w:r>
+    </w:p>
+    <w:p>
+      <w:r>
+        <w:rPr>
+          <w:b/>
+        </w:rPr>
+        <w:t xml:space="preserve">Dependencies: </w:t>
+      </w:r>
+      <w:r>
+        <w:t>Previous task in this phase</w:t>
+      </w:r>
+    </w:p>
+    <w:p>
+      <w:r>
+        <w:rPr>
+          <w:b/>
+        </w:rPr>
+        <w:t xml:space="preserve">Permission Map: </w:t>
+      </w:r>
+      <w:r>
+        <w:t>board:view/create/update/delete — 4 keys</w:t>
+      </w:r>
+    </w:p>
+    <w:p>
+      <w:pPr>
+        <w:pStyle w:val="Heading2"/>
+      </w:pPr>
+      <w:r>
+        <w:t>Task 14.5: Statuses &amp; Columns (status:view/create/update/delete — 4 keys, + list create/update/delete mapped to board)</w:t>
+      </w:r>
+    </w:p>
+    <w:p>
+      <w:r>
+        <w:rPr>
+          <w:b/>
+        </w:rPr>
+        <w:t xml:space="preserve">Objective: </w:t>
+      </w:r>
+      <w:r>
+        <w:t>Hides statuses section and column actions where permission missing.</w:t>
+      </w:r>
+    </w:p>
+    <w:p>
+      <w:r>
+        <w:rPr>
+          <w:b/>
+        </w:rPr>
+        <w:t xml:space="preserve">Key Actions: </w:t>
+      </w:r>
+      <w:r>
+        <w:t>Pages: Project Settings → Statuses, Board → Columns. Screens: Statuses table/cards. Buttons: Statuses section (status:view hidden), New Status (status:create hidden), rename status (status:update disabled), delete status (status:delete hidden), New/Edit/Delete column (board:create/update/delete).</w:t>
+      </w:r>
+    </w:p>
+    <w:p>
+      <w:r>
+        <w:rPr>
+          <w:b/>
+        </w:rPr>
+        <w:t xml:space="preserve">Exit Criteria: </w:t>
+      </w:r>
+      <w:r>
+        <w:t>Member without status:view never sees statuses section, without status:create never sees New Status.</w:t>
+      </w:r>
+    </w:p>
+    <w:p>
+      <w:r>
+        <w:rPr>
+          <w:b/>
+        </w:rPr>
+        <w:t xml:space="preserve">Hours: </w:t>
+      </w:r>
+      <w:r>
+        <w:t>0.5h</w:t>
+      </w:r>
+    </w:p>
+    <w:p>
+      <w:r>
+        <w:rPr>
+          <w:b/>
+        </w:rPr>
+        <w:t xml:space="preserve">Deliverables: </w:t>
+      </w:r>
+      <w:r>
+        <w:t>Statuses table, column modals</w:t>
+      </w:r>
+    </w:p>
+    <w:p>
+      <w:r>
+        <w:rPr>
+          <w:b/>
+        </w:rPr>
+        <w:t xml:space="preserve">Dependencies: </w:t>
+      </w:r>
+      <w:r>
+        <w:t>Previous task in this phase</w:t>
+      </w:r>
+    </w:p>
+    <w:p>
+      <w:r>
+        <w:rPr>
+          <w:b/>
+        </w:rPr>
+        <w:t xml:space="preserve">Permission Map: </w:t>
+      </w:r>
+      <w:r>
+        <w:t>status:view/create/update/delete — 4 keys, + list create/update/delete mapped to board</w:t>
+      </w:r>
+    </w:p>
+    <w:p>
+      <w:pPr>
+        <w:pStyle w:val="Heading2"/>
+      </w:pPr>
+      <w:r>
+        <w:t>Task 14.6: Tasks — View/Create/Update/Delete/Move/Assign (task:view/create/update/delete/move/assign — 6 keys)</w:t>
+      </w:r>
+    </w:p>
+    <w:p>
+      <w:r>
+        <w:rPr>
+          <w:b/>
+        </w:rPr>
+        <w:t xml:space="preserve">Objective: </w:t>
+      </w:r>
+      <w:r>
+        <w:t>Hides issue workflow where permission missing — this fixes the Create Issue button that was still only checking isClient.</w:t>
+      </w:r>
+    </w:p>
+    <w:p>
+      <w:r>
+        <w:rPr>
+          <w:b/>
+        </w:rPr>
+        <w:t xml:space="preserve">Key Actions: </w:t>
+      </w:r>
+      <w:r>
+        <w:t>Pages: Issues list, Backlog, Board cards. Screens: Issues header, board columns, task cards. Buttons: issues list and board cards (task:view hidden), New Task / Create Issue (task:create hidden), edit title/description/priority inside detail (task:update disabled), delete task (task:delete hidden), drag and move dropdown (task:move disabled), assignee picker (task:assign hidden).</w:t>
+      </w:r>
+    </w:p>
+    <w:p>
+      <w:r>
+        <w:rPr>
+          <w:b/>
+        </w:rPr>
+        <w:t xml:space="preserve">Exit Criteria: </w:t>
+      </w:r>
+      <w:r>
+        <w:t>Member without task:create never sees New Task, without task:move cannot drag, without task:assign cannot see assignee picker, OrgAdmin with zero rows can do all.</w:t>
+      </w:r>
+    </w:p>
+    <w:p>
+      <w:r>
+        <w:rPr>
+          <w:b/>
+        </w:rPr>
+        <w:t xml:space="preserve">Hours: </w:t>
+      </w:r>
+      <w:r>
+        <w:t>1h</w:t>
+      </w:r>
+    </w:p>
+    <w:p>
+      <w:r>
+        <w:rPr>
+          <w:b/>
+        </w:rPr>
+        <w:t xml:space="preserve">Deliverables: </w:t>
+      </w:r>
+      <w:r>
+        <w:t>Board, issues, modals, drag</w:t>
+      </w:r>
+    </w:p>
+    <w:p>
+      <w:r>
+        <w:rPr>
+          <w:b/>
+        </w:rPr>
+        <w:t xml:space="preserve">Dependencies: </w:t>
+      </w:r>
+      <w:r>
+        <w:t>Previous task in this phase</w:t>
+      </w:r>
+    </w:p>
+    <w:p>
+      <w:r>
+        <w:rPr>
+          <w:b/>
+        </w:rPr>
+        <w:t xml:space="preserve">Permission Map: </w:t>
+      </w:r>
+      <w:r>
+        <w:t>task:view/create/update/delete/move/assign — 6 keys</w:t>
+      </w:r>
+    </w:p>
+    <w:p>
+      <w:pPr>
+        <w:pStyle w:val="Heading2"/>
+      </w:pPr>
+      <w:r>
+        <w:t>Task 14.7: Comments &amp; Attachments (comment:view/create — 2 keys, attachment:view/create/update/delete — 4 keys)</w:t>
+      </w:r>
+    </w:p>
+    <w:p>
+      <w:r>
+        <w:rPr>
+          <w:b/>
+        </w:rPr>
+        <w:t xml:space="preserve">Objective: </w:t>
+      </w:r>
+      <w:r>
+        <w:t>Hides comment and attachment workflow where permission missing.</w:t>
+      </w:r>
+    </w:p>
+    <w:p>
+      <w:r>
+        <w:rPr>
+          <w:b/>
+        </w:rPr>
+        <w:t xml:space="preserve">Key Actions: </w:t>
+      </w:r>
+      <w:r>
+        <w:t>Pages: Task detail modal. Screens: Comments thread, Attachments section. Buttons: comments thread (comment:view hidden), Add Comment (comment:create hidden), attachments section (attachment:view hidden), Upload (attachment:create hidden), rename (attachment:update disabled), delete (attachment:delete hidden).</w:t>
+      </w:r>
+    </w:p>
+    <w:p>
+      <w:r>
+        <w:rPr>
+          <w:b/>
+        </w:rPr>
+        <w:t xml:space="preserve">Exit Criteria: </w:t>
+      </w:r>
+      <w:r>
+        <w:t>Member without comment:create never sees Add Comment, without attachment:view never sees attachments.</w:t>
+      </w:r>
+    </w:p>
+    <w:p>
+      <w:r>
+        <w:rPr>
+          <w:b/>
+        </w:rPr>
+        <w:t xml:space="preserve">Hours: </w:t>
+      </w:r>
+      <w:r>
+        <w:t>0.5h</w:t>
+      </w:r>
+    </w:p>
+    <w:p>
+      <w:r>
+        <w:rPr>
+          <w:b/>
+        </w:rPr>
+        <w:t xml:space="preserve">Deliverables: </w:t>
+      </w:r>
+      <w:r>
+        <w:t>Task detail modal sections</w:t>
+      </w:r>
+    </w:p>
+    <w:p>
+      <w:r>
+        <w:rPr>
+          <w:b/>
+        </w:rPr>
+        <w:t xml:space="preserve">Dependencies: </w:t>
+      </w:r>
+      <w:r>
+        <w:t>Previous task in this phase</w:t>
+      </w:r>
+    </w:p>
+    <w:p>
+      <w:r>
+        <w:rPr>
+          <w:b/>
+        </w:rPr>
+        <w:t xml:space="preserve">Permission Map: </w:t>
+      </w:r>
+      <w:r>
+        <w:t>comment:view/create — 2 keys, attachment:view/create/update/delete — 4 keys</w:t>
+      </w:r>
+    </w:p>
+    <w:p>
+      <w:pPr>
+        <w:pStyle w:val="Heading2"/>
+      </w:pPr>
+      <w:r>
+        <w:t>Task 14.8: Activity &amp; Roles + Verify All 35 End-to-End (activity:view:org/project — 2 keys, role:view/manage — 2 keys + final matrix)</w:t>
+      </w:r>
+    </w:p>
+    <w:p>
+      <w:r>
+        <w:rPr>
+          <w:b/>
+        </w:rPr>
+        <w:t xml:space="preserve">Objective: </w:t>
+      </w:r>
+      <w:r>
+        <w:t>Hides audit and role management where permission missing, then proves every button that should be hidden is hidden.</w:t>
+      </w:r>
+    </w:p>
+    <w:p>
+      <w:r>
+        <w:rPr>
+          <w:b/>
+        </w:rPr>
+        <w:t xml:space="preserve">Key Actions: </w:t>
+      </w:r>
+      <w:r>
+        <w:t>Pages: Organization Activity timeline, Project Activity timeline, Custom Roles list, Permissions matrix. Buttons: org activity tab (activity:view:org hidden), project activity tab (activity:view:project hidden), Custom Roles list (role:view hidden), Create Role and tick save (role:manage hidden/disabled). Then incognito test as OrgAdmin creates workspace → project → board → status → task → move → assign → comment → attachment → activity, and as Viewer with only view keys confirms create buttons not visible and direct API still 403.</w:t>
+      </w:r>
+    </w:p>
+    <w:p>
+      <w:r>
+        <w:rPr>
+          <w:b/>
+        </w:rPr>
+        <w:t xml:space="preserve">Exit Criteria: </w:t>
+      </w:r>
+      <w:r>
+        <w:t>All 35 keys mapped and verified, no spurious 403 toast, no hidden button visible for disallowed, single human toast only.</w:t>
+      </w:r>
+    </w:p>
+    <w:p>
+      <w:r>
+        <w:rPr>
+          <w:b/>
+        </w:rPr>
+        <w:t xml:space="preserve">Hours: </w:t>
+      </w:r>
+      <w:r>
+        <w:t>1h</w:t>
+      </w:r>
+    </w:p>
+    <w:p>
+      <w:r>
+        <w:rPr>
+          <w:b/>
+        </w:rPr>
+        <w:t xml:space="preserve">Deliverables: </w:t>
+      </w:r>
+      <w:r>
+        <w:t>Activity tabs, roles, matrix, verification matrix</w:t>
+      </w:r>
+    </w:p>
+    <w:p>
+      <w:r>
+        <w:rPr>
+          <w:b/>
+        </w:rPr>
+        <w:t xml:space="preserve">Dependencies: </w:t>
+      </w:r>
+      <w:r>
+        <w:t>Previous task in this phase</w:t>
+      </w:r>
+    </w:p>
+    <w:p>
+      <w:r>
+        <w:rPr>
+          <w:b/>
+        </w:rPr>
+        <w:t xml:space="preserve">Permission Map: </w:t>
+      </w:r>
+      <w:r>
+        <w:t>activity:view:org/project — 2 keys, role:view/manage — 2 keys + final matrix</w:t>
+      </w:r>
+    </w:p>
+    <w:p>
+      <w:r>
+        <w:br w:type="page"/>
+      </w:r>
+    </w:p>
+    <w:p>
+      <w:pPr>
+        <w:pStyle w:val="Heading1"/>
+      </w:pPr>
+      <w:r>
+        <w:t>Phase 15: Detailed Permission-Aware UI — Every Screen &amp; Every Button Hidden Where Permission Missing (Human Text Hidden, New Sprint/Team/Environment Keys)</w:t>
+      </w:r>
+    </w:p>
+    <w:p>
+      <w:r>
+        <w:rPr>
+          <w:b/>
+        </w:rPr>
+        <w:t xml:space="preserve">Goal: </w:t>
+      </w:r>
+      <w:r>
+        <w:t>Make the frontend fully permission-aware so no write button is visible when its key is missing and no view section is visible when view is missing. Replace the temporary View only — missing key badges with simply hiding the button or section. Add dedicated permission keys for sprints, teams and environments so they are no longer tied to board or project, seeding them into the database and putting them in the shared constants as the single source. Every screen and every button that maps to the 35 plus new keys is handled via the single hasPermissionSync(workspaceId, key) helper with isOrgAdmin and isSuperAdmin bypass first. Backend remains the enforcer.</w:t>
+      </w:r>
+    </w:p>
+    <w:p>
+      <w:r>
+        <w:rPr>
+          <w:b/>
+        </w:rPr>
+        <w:t xml:space="preserve">Detail from discussion: </w:t>
+      </w:r>
+      <w:r>
+        <w:t>Backend already has OrgAdmin bypass with zero WorkspaceMembers via IsOrgAdminInOrgAsync and SuperAdmin via Users.IsSuperAdmin. Frontend uses me 5 minute dedup and PermissionKeys constants, no hard-coded strings. After this phase a custom Viewer with only view keys will see no New, Edit or Delete buttons anywhere, and an OrgAdmin with zero workspace rows will still see and be able to create in Marketing or any workspace. Disabled with tooltip is only used for edit where the row stays visible, otherwise the button is hidden completely. All new sprint, team and environment keys are added to BuildingBlocks SharedKernel PermissionKeys and seeded into identity Permissions, and mirrored in frontend shared constants permissions, so changing the key in one file updates both frontend and database.</w:t>
+      </w:r>
+    </w:p>
+    <w:p>
+      <w:pPr>
+        <w:pStyle w:val="Heading2"/>
+      </w:pPr>
+      <w:r>
+        <w:t>Task 15.1: Add New Permission Keys for Sprints, Teams, Environments to Database and Shared Files</w:t>
+      </w:r>
+    </w:p>
+    <w:p>
+      <w:r>
+        <w:rPr>
+          <w:b/>
+        </w:rPr>
+        <w:t xml:space="preserve">Objective: </w:t>
+      </w:r>
+      <w:r>
+        <w:t>Create separate keys so sprints, teams and environments are not tied to board or project. Seed into identity Permissions and expose as single source constants.</w:t>
+      </w:r>
+    </w:p>
+    <w:p>
+      <w:r>
+        <w:rPr>
+          <w:b/>
+        </w:rPr>
+        <w:t xml:space="preserve">Key Actions: </w:t>
+      </w:r>
+      <w:r>
+        <w:t>Database: add sprint:view, sprint:create, sprint:update, sprint:delete, team:view, team:create, team:update, team:delete, environment:view, environment:create, environment:update, environment:delete via IdentitySeeder from PermissionKeys. Shared files: add same keys to backend SharedKernel PermissionKeys and frontend shared constants permissions. Backend services for sprints, teams and environments switch from board:create or CanUpload checks to the new keys with IsOrgAdminInOrgAsync bypass. Frontend helpers for those screens switch to hasPermissionSync with the new keys.</w:t>
+      </w:r>
+    </w:p>
+    <w:p>
+      <w:r>
+        <w:rPr>
+          <w:b/>
+        </w:rPr>
+        <w:t xml:space="preserve">Screens &amp; Buttons: </w:t>
+      </w:r>
+      <w:r>
+        <w:t>PermissionKeys backend and frontend, IdentitySeeder, SprintService TeamService EnvironmentService</w:t>
+      </w:r>
+    </w:p>
+    <w:p>
+      <w:r>
+        <w:rPr>
+          <w:b/>
+        </w:rPr>
+        <w:t xml:space="preserve">Exit Criteria: </w:t>
+      </w:r>
+      <w:r>
+        <w:t>Backend build 0 errors, GET permissions returns the new keys, frontend build uses PermissionKeys.SprintCreate etc with no string literals.</w:t>
+      </w:r>
+    </w:p>
+    <w:p>
+      <w:r>
+        <w:rPr>
+          <w:b/>
+        </w:rPr>
+        <w:t xml:space="preserve">Hours: </w:t>
+      </w:r>
+      <w:r>
+        <w:t>1h</w:t>
+      </w:r>
+    </w:p>
+    <w:p>
+      <w:r>
+        <w:rPr>
+          <w:b/>
+        </w:rPr>
+        <w:t xml:space="preserve">Dependencies: </w:t>
+      </w:r>
+      <w:r>
+        <w:t>Previous task in this phase</w:t>
+      </w:r>
+    </w:p>
+    <w:p>
+      <w:r>
+        <w:rPr>
+          <w:b/>
+        </w:rPr>
+        <w:t xml:space="preserve">Permission Map: </w:t>
+      </w:r>
+      <w:r>
+        <w:t>All keys</w:t>
+      </w:r>
+    </w:p>
+    <w:p>
+      <w:pPr>
+        <w:pStyle w:val="Heading2"/>
+      </w:pPr>
+      <w:r>
+        <w:t>Task 15.2: Organization Screens — Hide Where org:view/update/delete Missing</w:t>
+      </w:r>
+    </w:p>
+    <w:p>
+      <w:r>
+        <w:rPr>
+          <w:b/>
+        </w:rPr>
+        <w:t xml:space="preserve">Objective: </w:t>
+      </w:r>
+      <w:r>
+        <w:t>Hide organization name and members list and delete organization where permission missing, with no badge text.</w:t>
+      </w:r>
+    </w:p>
+    <w:p>
+      <w:r>
+        <w:rPr>
+          <w:b/>
+        </w:rPr>
+        <w:t xml:space="preserve">Key Actions: </w:t>
+      </w:r>
+      <w:r>
+        <w:t>Screens: Organization header shown in workspaces and members pages, organization members list, organization settings if present. Buttons: Edit Organization dialog disabled when org:update missing, Delete Organization hidden when org:delete missing, whole organization header and members list hidden when org:view missing. Hide completely, no View only text.</w:t>
+      </w:r>
+    </w:p>
+    <w:p>
+      <w:r>
+        <w:rPr>
+          <w:b/>
+        </w:rPr>
+        <w:t xml:space="preserve">Screens &amp; Buttons: </w:t>
+      </w:r>
+      <w:r>
+        <w:t>Organization header, members list, settings dialogs</w:t>
+      </w:r>
+    </w:p>
+    <w:p>
+      <w:r>
+        <w:rPr>
+          <w:b/>
+        </w:rPr>
+        <w:t xml:space="preserve">Exit Criteria: </w:t>
+      </w:r>
+      <w:r>
+        <w:t>Member without org:view sees no organization header or members, OrgAdmin sees all.</w:t>
+      </w:r>
+    </w:p>
+    <w:p>
+      <w:r>
+        <w:rPr>
+          <w:b/>
+        </w:rPr>
+        <w:t xml:space="preserve">Hours: </w:t>
+      </w:r>
+      <w:r>
+        <w:t>0.5h</w:t>
+      </w:r>
+    </w:p>
+    <w:p>
+      <w:r>
+        <w:rPr>
+          <w:b/>
+        </w:rPr>
+        <w:t xml:space="preserve">Dependencies: </w:t>
+      </w:r>
+      <w:r>
+        <w:t>Previous task in this phase</w:t>
+      </w:r>
+    </w:p>
+    <w:p>
+      <w:r>
+        <w:rPr>
+          <w:b/>
+        </w:rPr>
+        <w:t xml:space="preserve">Permission Map: </w:t>
+      </w:r>
+      <w:r>
+        <w:t>All keys</w:t>
+      </w:r>
+    </w:p>
+    <w:p>
+      <w:pPr>
+        <w:pStyle w:val="Heading2"/>
+      </w:pPr>
+      <w:r>
+        <w:t>Task 15.3: Workspaces Screens — Hide Where workspace:view/create/update/delete Missing</w:t>
+      </w:r>
+    </w:p>
+    <w:p>
+      <w:r>
+        <w:rPr>
+          <w:b/>
+        </w:rPr>
+        <w:t xml:space="preserve">Objective: </w:t>
+      </w:r>
+      <w:r>
+        <w:t>Hide workspace list, board access, new workspace, rename and delete where permission missing.</w:t>
+      </w:r>
+    </w:p>
+    <w:p>
+      <w:r>
+        <w:rPr>
+          <w:b/>
+        </w:rPr>
+        <w:t xml:space="preserve">Key Actions: </w:t>
+      </w:r>
+      <w:r>
+        <w:t>Screens: Workspaces list page with cards grid. Buttons: New Workspace hidden when workspace:create missing, Open Workspace hidden when workspace:view missing, whole card hidden when workspace:view missing, Edit or rename hidden or disabled when workspace:update missing, Delete workspace hidden when workspace:delete missing. All hidden, no badge.</w:t>
+      </w:r>
+    </w:p>
+    <w:p>
+      <w:r>
+        <w:rPr>
+          <w:b/>
+        </w:rPr>
+        <w:t xml:space="preserve">Screens &amp; Buttons: </w:t>
+      </w:r>
+      <w:r>
+        <w:t>Workspaces page, cards, dropdown, Open button, modals</w:t>
+      </w:r>
+    </w:p>
+    <w:p>
+      <w:r>
+        <w:rPr>
+          <w:b/>
+        </w:rPr>
+        <w:t xml:space="preserve">Exit Criteria: </w:t>
+      </w:r>
+      <w:r>
+        <w:t>Viewer sees no New Workspace and no Open on workspaces without view.</w:t>
+      </w:r>
+    </w:p>
+    <w:p>
+      <w:r>
+        <w:rPr>
+          <w:b/>
+        </w:rPr>
+        <w:t xml:space="preserve">Hours: </w:t>
+      </w:r>
+      <w:r>
+        <w:t>0.5h</w:t>
+      </w:r>
+    </w:p>
+    <w:p>
+      <w:r>
+        <w:rPr>
+          <w:b/>
+        </w:rPr>
+        <w:t xml:space="preserve">Dependencies: </w:t>
+      </w:r>
+      <w:r>
+        <w:t>Previous task in this phase</w:t>
+      </w:r>
+    </w:p>
+    <w:p>
+      <w:r>
+        <w:rPr>
+          <w:b/>
+        </w:rPr>
+        <w:t xml:space="preserve">Permission Map: </w:t>
+      </w:r>
+      <w:r>
+        <w:t>All keys</w:t>
+      </w:r>
+    </w:p>
+    <w:p>
+      <w:pPr>
+        <w:pStyle w:val="Heading2"/>
+      </w:pPr>
+      <w:r>
+        <w:t>Task 15.4: Projects Screens — Global Sidebar and Per-Workspace (project:view/create/update/delete)</w:t>
+      </w:r>
+    </w:p>
+    <w:p>
+      <w:r>
+        <w:rPr>
+          <w:b/>
+        </w:rPr>
+        <w:t xml:space="preserve">Objective: </w:t>
+      </w:r>
+      <w:r>
+        <w:t>Fix both the projects inside each workspace and the separate global Projects page in the organization sidebar menu that was still using canCreateProjectEffective for all actions.</w:t>
+      </w:r>
+    </w:p>
+    <w:p>
+      <w:r>
+        <w:rPr>
+          <w:b/>
+        </w:rPr>
+        <w:t xml:space="preserve">Key Actions: </w:t>
+      </w:r>
+      <w:r>
+        <w:t>Screens: Per-workspace projects at /w/:wid and global Projects at /projects. Buttons: New Project hidden when project:create missing, project cards and Open Boards hidden when project:view missing, Edit project disabled when project:update missing, Delete project hidden when project:delete missing. Per-card checks use hasPermissionSync(project.workspaceId, key). Hide, no badge.</w:t>
+      </w:r>
+    </w:p>
+    <w:p>
+      <w:r>
+        <w:rPr>
+          <w:b/>
+        </w:rPr>
+        <w:t xml:space="preserve">Screens &amp; Buttons: </w:t>
+      </w:r>
+      <w:r>
+        <w:t>Both projects pages, cards, modals, Open Boards link</w:t>
+      </w:r>
+    </w:p>
+    <w:p>
+      <w:r>
+        <w:rPr>
+          <w:b/>
+        </w:rPr>
+        <w:t xml:space="preserve">Exit Criteria: </w:t>
+      </w:r>
+      <w:r>
+        <w:t>Global Projects now checks per project.workspaceId, member without project:create never sees New Project anywhere.</w:t>
+      </w:r>
+    </w:p>
+    <w:p>
+      <w:r>
+        <w:rPr>
+          <w:b/>
+        </w:rPr>
+        <w:t xml:space="preserve">Hours: </w:t>
+      </w:r>
+      <w:r>
+        <w:t>1h</w:t>
+      </w:r>
+    </w:p>
+    <w:p>
+      <w:r>
+        <w:rPr>
+          <w:b/>
+        </w:rPr>
+        <w:t xml:space="preserve">Dependencies: </w:t>
+      </w:r>
+      <w:r>
+        <w:t>Previous task in this phase</w:t>
+      </w:r>
+    </w:p>
+    <w:p>
+      <w:r>
+        <w:rPr>
+          <w:b/>
+        </w:rPr>
+        <w:t xml:space="preserve">Permission Map: </w:t>
+      </w:r>
+      <w:r>
+        <w:t>project:view/create/update/delete</w:t>
+      </w:r>
+    </w:p>
+    <w:p>
+      <w:pPr>
+        <w:pStyle w:val="Heading2"/>
+      </w:pPr>
+      <w:r>
+        <w:t>Task 15.5: Boards and Columns Screens (board:view/create/update/delete)</w:t>
+      </w:r>
+    </w:p>
+    <w:p>
+      <w:r>
+        <w:rPr>
+          <w:b/>
+        </w:rPr>
+        <w:t xml:space="preserve">Objective: </w:t>
+      </w:r>
+      <w:r>
+        <w:t>Hide boards tab and board configuration where permission missing.</w:t>
+      </w:r>
+    </w:p>
+    <w:p>
+      <w:r>
+        <w:rPr>
+          <w:b/>
+        </w:rPr>
+        <w:t xml:space="preserve">Key Actions: </w:t>
+      </w:r>
+      <w:r>
+        <w:t>Screens: Boards tab inside project, Boards grid, Board settings. Buttons: Boards tab hidden when board:view missing, New Board hidden when board:create missing, rename board and column settings disabled when board:update missing, delete board hidden when board:delete missing, New Column, Edit Column, Delete Column similarly gated.</w:t>
+      </w:r>
+    </w:p>
+    <w:p>
+      <w:r>
+        <w:rPr>
+          <w:b/>
+        </w:rPr>
+        <w:t xml:space="preserve">Screens &amp; Buttons: </w:t>
+      </w:r>
+      <w:r>
+        <w:t>Boards tab, grid, board modals, column modals</w:t>
+      </w:r>
+    </w:p>
+    <w:p>
+      <w:r>
+        <w:rPr>
+          <w:b/>
+        </w:rPr>
+        <w:t xml:space="preserve">Exit Criteria: </w:t>
+      </w:r>
+      <w:r>
+        <w:t>Member without board:view sees no boards tab or grid.</w:t>
+      </w:r>
+    </w:p>
+    <w:p>
+      <w:r>
+        <w:rPr>
+          <w:b/>
+        </w:rPr>
+        <w:t xml:space="preserve">Hours: </w:t>
+      </w:r>
+      <w:r>
+        <w:t>0.5h</w:t>
+      </w:r>
+    </w:p>
+    <w:p>
+      <w:r>
+        <w:rPr>
+          <w:b/>
+        </w:rPr>
+        <w:t xml:space="preserve">Dependencies: </w:t>
+      </w:r>
+      <w:r>
+        <w:t>Previous task in this phase</w:t>
+      </w:r>
+    </w:p>
+    <w:p>
+      <w:r>
+        <w:rPr>
+          <w:b/>
+        </w:rPr>
+        <w:t xml:space="preserve">Permission Map: </w:t>
+      </w:r>
+      <w:r>
+        <w:t>board:view/create/update/delete</w:t>
+      </w:r>
+    </w:p>
+    <w:p>
+      <w:pPr>
+        <w:pStyle w:val="Heading2"/>
+      </w:pPr>
+      <w:r>
+        <w:t>Task 15.6: Statuses Screens (status:view/create/update/delete) and Lists</w:t>
+      </w:r>
+    </w:p>
+    <w:p>
+      <w:r>
+        <w:rPr>
+          <w:b/>
+        </w:rPr>
+        <w:t xml:space="preserve">Objective: </w:t>
+      </w:r>
+      <w:r>
+        <w:t>Hide statuses section and column mapping where permission missing.</w:t>
+      </w:r>
+    </w:p>
+    <w:p>
+      <w:r>
+        <w:rPr>
+          <w:b/>
+        </w:rPr>
+        <w:t xml:space="preserve">Key Actions: </w:t>
+      </w:r>
+      <w:r>
+        <w:t>Screens: Project Settings statuses. Buttons: Statuses section hidden when status:view missing, New Status hidden when status:create missing, rename status disabled when status:update missing, delete status hidden when status:delete missing.</w:t>
+      </w:r>
+    </w:p>
+    <w:p>
+      <w:r>
+        <w:rPr>
+          <w:b/>
+        </w:rPr>
+        <w:t xml:space="preserve">Screens &amp; Buttons: </w:t>
+      </w:r>
+      <w:r>
+        <w:t>Statuses table and cards, status modals</w:t>
+      </w:r>
+    </w:p>
+    <w:p>
+      <w:r>
+        <w:rPr>
+          <w:b/>
+        </w:rPr>
+        <w:t xml:space="preserve">Exit Criteria: </w:t>
+      </w:r>
+      <w:r>
+        <w:t>Without status:view the whole statuses section is hidden.</w:t>
+      </w:r>
+    </w:p>
+    <w:p>
+      <w:r>
+        <w:rPr>
+          <w:b/>
+        </w:rPr>
+        <w:t xml:space="preserve">Hours: </w:t>
+      </w:r>
+      <w:r>
+        <w:t>0.5h</w:t>
+      </w:r>
+    </w:p>
+    <w:p>
+      <w:r>
+        <w:rPr>
+          <w:b/>
+        </w:rPr>
+        <w:t xml:space="preserve">Dependencies: </w:t>
+      </w:r>
+      <w:r>
+        <w:t>Previous task in this phase</w:t>
+      </w:r>
+    </w:p>
+    <w:p>
+      <w:r>
+        <w:rPr>
+          <w:b/>
+        </w:rPr>
+        <w:t xml:space="preserve">Permission Map: </w:t>
+      </w:r>
+      <w:r>
+        <w:t>status:view/create/update/delete</w:t>
+      </w:r>
+    </w:p>
+    <w:p>
+      <w:pPr>
+        <w:pStyle w:val="Heading2"/>
+      </w:pPr>
+      <w:r>
+        <w:t>Task 15.7: Tasks Screens — Issues List, Backlog, Board Cards, Create/Edit/Move/Assign (task:view/create/update/delete/move/assign)</w:t>
+      </w:r>
+    </w:p>
+    <w:p>
+      <w:r>
+        <w:rPr>
+          <w:b/>
+        </w:rPr>
+        <w:t xml:space="preserve">Objective: </w:t>
+      </w:r>
+      <w:r>
+        <w:t>Hide issue workflow where permission missing, including the Create Issue button that was still only checking isClient.</w:t>
+      </w:r>
+    </w:p>
+    <w:p>
+      <w:r>
+        <w:rPr>
+          <w:b/>
+        </w:rPr>
+        <w:t xml:space="preserve">Key Actions: </w:t>
+      </w:r>
+      <w:r>
+        <w:t>Screens: Issues list, Backlog, Board columns and cards, Create Issue popup, Task detail edit fields. Buttons: issues list and board cards hidden when task:view missing, New Task and Create Issue hidden when task:create missing, edit title description priority etc disabled when task:update missing, delete task hidden when task:delete missing, drag and move dropdown disabled when task:move missing, assignee picker hidden when task:assign missing. Hide for create/delete/move/assign, disable for update with tooltip.</w:t>
+      </w:r>
+    </w:p>
+    <w:p>
+      <w:r>
+        <w:rPr>
+          <w:b/>
+        </w:rPr>
+        <w:t xml:space="preserve">Screens &amp; Buttons: </w:t>
+      </w:r>
+      <w:r>
+        <w:t>Board drag, issues header, backlog, task cards, task detail fields, assignee picker</w:t>
+      </w:r>
+    </w:p>
+    <w:p>
+      <w:r>
+        <w:rPr>
+          <w:b/>
+        </w:rPr>
+        <w:t xml:space="preserve">Exit Criteria: </w:t>
+      </w:r>
+      <w:r>
+        <w:t>Viewer sees no New Task and cannot drag or assign, OrgAdmin with zero rows can do all.</w:t>
+      </w:r>
+    </w:p>
+    <w:p>
+      <w:r>
+        <w:rPr>
+          <w:b/>
+        </w:rPr>
+        <w:t xml:space="preserve">Hours: </w:t>
+      </w:r>
+      <w:r>
+        <w:t>1h</w:t>
+      </w:r>
+    </w:p>
+    <w:p>
+      <w:r>
+        <w:rPr>
+          <w:b/>
+        </w:rPr>
+        <w:t xml:space="preserve">Dependencies: </w:t>
+      </w:r>
+      <w:r>
+        <w:t>Previous task in this phase</w:t>
+      </w:r>
+    </w:p>
+    <w:p>
+      <w:r>
+        <w:rPr>
+          <w:b/>
+        </w:rPr>
+        <w:t xml:space="preserve">Permission Map: </w:t>
+      </w:r>
+      <w:r>
+        <w:t>task:view/create/update/delete/move/assign</w:t>
+      </w:r>
+    </w:p>
+    <w:p>
+      <w:pPr>
+        <w:pStyle w:val="Heading2"/>
+      </w:pPr>
+      <w:r>
+        <w:t>Task 15.8: Comments Screens (comment:view/create) and Attachments Screens (attachment:view/create/update/delete)</w:t>
+      </w:r>
+    </w:p>
+    <w:p>
+      <w:r>
+        <w:rPr>
+          <w:b/>
+        </w:rPr>
+        <w:t xml:space="preserve">Objective: </w:t>
+      </w:r>
+      <w:r>
+        <w:t>Hide comment and attachment workflow where permission missing.</w:t>
+      </w:r>
+    </w:p>
+    <w:p>
+      <w:r>
+        <w:rPr>
+          <w:b/>
+        </w:rPr>
+        <w:t xml:space="preserve">Key Actions: </w:t>
+      </w:r>
+      <w:r>
+        <w:t>Screens: Task detail modal comments thread and attachments section. Buttons: comments thread hidden when comment:view missing, Add Comment hidden when comment:create missing, attachments section hidden when attachment:view missing, Upload hidden when attachment:create missing, rename disabled when attachment:update missing, delete hidden when attachment:delete missing.</w:t>
+      </w:r>
+    </w:p>
+    <w:p>
+      <w:r>
+        <w:rPr>
+          <w:b/>
+        </w:rPr>
+        <w:t xml:space="preserve">Screens &amp; Buttons: </w:t>
+      </w:r>
+      <w:r>
+        <w:t>Task detail modal tabs, comment input, attachment grid and upload</w:t>
+      </w:r>
+    </w:p>
+    <w:p>
+      <w:r>
+        <w:rPr>
+          <w:b/>
+        </w:rPr>
+        <w:t xml:space="preserve">Exit Criteria: </w:t>
+      </w:r>
+      <w:r>
+        <w:t>Without comment:create no Add Comment box, without attachment:view no attachments section.</w:t>
+      </w:r>
+    </w:p>
+    <w:p>
+      <w:r>
+        <w:rPr>
+          <w:b/>
+        </w:rPr>
+        <w:t xml:space="preserve">Hours: </w:t>
+      </w:r>
+      <w:r>
+        <w:t>0.5h</w:t>
+      </w:r>
+    </w:p>
+    <w:p>
+      <w:r>
+        <w:rPr>
+          <w:b/>
+        </w:rPr>
+        <w:t xml:space="preserve">Dependencies: </w:t>
+      </w:r>
+      <w:r>
+        <w:t>Previous task in this phase</w:t>
+      </w:r>
+    </w:p>
+    <w:p>
+      <w:r>
+        <w:rPr>
+          <w:b/>
+        </w:rPr>
+        <w:t xml:space="preserve">Permission Map: </w:t>
+      </w:r>
+      <w:r>
+        <w:t>comment:view/create</w:t>
+      </w:r>
+    </w:p>
+    <w:p>
+      <w:pPr>
+        <w:pStyle w:val="Heading2"/>
+      </w:pPr>
+      <w:r>
+        <w:t>Task 15.9: Sprints, Teams and Environments Screens (new keys) and Project Settings Save/Delete</w:t>
+      </w:r>
+    </w:p>
+    <w:p>
+      <w:r>
+        <w:rPr>
+          <w:b/>
+        </w:rPr>
+        <w:t xml:space="preserve">Objective: </w:t>
+      </w:r>
+      <w:r>
+        <w:t>Hide sprint, team and environment management where new keys missing, and gate project settings save and delete.</w:t>
+      </w:r>
+    </w:p>
+    <w:p>
+      <w:r>
+        <w:rPr>
+          <w:b/>
+        </w:rPr>
+        <w:t xml:space="preserve">Key Actions: </w:t>
+      </w:r>
+      <w:r>
+        <w:t>Screens: Sprints tab, Teams tab, Environments tab, Project Settings. Buttons: View sprints/teams/environments hidden when respective view missing, New Sprint/Team/Environment hidden when create missing, Edit or rename hidden or disabled when update missing, Delete hidden when delete missing. Project Settings Save disabled when project:update missing, Delete Project hidden when project:delete missing. Hide for create/delete/view, disable for update.</w:t>
+      </w:r>
+    </w:p>
+    <w:p>
+      <w:r>
+        <w:rPr>
+          <w:b/>
+        </w:rPr>
+        <w:t xml:space="preserve">Screens &amp; Buttons: </w:t>
+      </w:r>
+      <w:r>
+        <w:t>Sprints, teams, environments tabs, project settings</w:t>
+      </w:r>
+    </w:p>
+    <w:p>
+      <w:r>
+        <w:rPr>
+          <w:b/>
+        </w:rPr>
+        <w:t xml:space="preserve">Exit Criteria: </w:t>
+      </w:r>
+      <w:r>
+        <w:t>Without sprint:view no sprints tab, without team:create no New Team, without environment:create no New Environment.</w:t>
+      </w:r>
+    </w:p>
+    <w:p>
+      <w:r>
+        <w:rPr>
+          <w:b/>
+        </w:rPr>
+        <w:t xml:space="preserve">Hours: </w:t>
+      </w:r>
+      <w:r>
+        <w:t>1h</w:t>
+      </w:r>
+    </w:p>
+    <w:p>
+      <w:r>
+        <w:rPr>
+          <w:b/>
+        </w:rPr>
+        <w:t xml:space="preserve">Dependencies: </w:t>
+      </w:r>
+      <w:r>
+        <w:t>Previous task in this phase</w:t>
+      </w:r>
+    </w:p>
+    <w:p>
+      <w:r>
+        <w:rPr>
+          <w:b/>
+        </w:rPr>
+        <w:t xml:space="preserve">Permission Map: </w:t>
+      </w:r>
+      <w:r>
+        <w:t>new keys</w:t>
+      </w:r>
+    </w:p>
+    <w:p>
+      <w:pPr>
+        <w:pStyle w:val="Heading2"/>
+      </w:pPr>
+      <w:r>
+        <w:t>Task 15.10: Activity and Roles Screens (activity:view:org/project, role:view/manage) and Verify All Keys End-to-End</w:t>
+      </w:r>
+    </w:p>
+    <w:p>
+      <w:r>
+        <w:rPr>
+          <w:b/>
+        </w:rPr>
+        <w:t xml:space="preserve">Objective: </w:t>
+      </w:r>
+      <w:r>
+        <w:t>Hide audit and role management where permission missing, then prove every button that should be hidden is hidden.</w:t>
+      </w:r>
+    </w:p>
+    <w:p>
+      <w:r>
+        <w:rPr>
+          <w:b/>
+        </w:rPr>
+        <w:t xml:space="preserve">Key Actions: </w:t>
+      </w:r>
+      <w:r>
+        <w:t>Screens: Organization Activity timeline, Project Activity timeline, Custom Roles list, Permissions matrix. Buttons: org activity tab hidden when activity:view:org missing, project activity tab hidden when activity:view:project missing, Custom Roles list hidden when role:view missing, Create Role and Save Permissions hidden or disabled when role:manage missing. Then incognito test as OrgAdmin creates workspace then project then board then status then task then move then assign then comment then attachment then sprint then team then environment then activity, and as Viewer with only view keys confirms create buttons not visible and direct API still 403 with single human toast.</w:t>
+      </w:r>
+    </w:p>
+    <w:p>
+      <w:r>
+        <w:rPr>
+          <w:b/>
+        </w:rPr>
+        <w:t xml:space="preserve">Screens &amp; Buttons: </w:t>
+      </w:r>
+      <w:r>
+        <w:t>Activity tabs, roles list, matrix, verification matrix for all keys</w:t>
+      </w:r>
+    </w:p>
+    <w:p>
+      <w:r>
+        <w:rPr>
+          <w:b/>
+        </w:rPr>
+        <w:t xml:space="preserve">Exit Criteria: </w:t>
+      </w:r>
+      <w:r>
+        <w:t>All keys plus new sprint team environment mapped and verified, no View only badge text, simply hidden, no hard-coded strings, single helper everywhere.</w:t>
+      </w:r>
+    </w:p>
+    <w:p>
+      <w:r>
+        <w:rPr>
+          <w:b/>
+        </w:rPr>
+        <w:t xml:space="preserve">Hours: </w:t>
+      </w:r>
+      <w:r>
+        <w:t>1h</w:t>
+      </w:r>
+    </w:p>
+    <w:p>
+      <w:r>
+        <w:rPr>
+          <w:b/>
+        </w:rPr>
+        <w:t xml:space="preserve">Dependencies: </w:t>
+      </w:r>
+      <w:r>
+        <w:t>Previous task in this phase</w:t>
+      </w:r>
+    </w:p>
+    <w:p>
+      <w:r>
+        <w:rPr>
+          <w:b/>
+        </w:rPr>
+        <w:t xml:space="preserve">Permission Map: </w:t>
+      </w:r>
+      <w:r>
+        <w:t>activity:view:org/project, role:view/manage</w:t>
+      </w:r>
+    </w:p>
+    <w:p>
+      <w:r>
+        <w:br w:type="page"/>
+      </w:r>
+    </w:p>
+    <w:p>
+      <w:pPr>
+        <w:pStyle w:val="Heading1"/>
+      </w:pPr>
+      <w:r>
+        <w:t>Phase 16: Remaining Permission Gaps — Issues Per-Issue Actions, Task Detail, Teams, Project Members, Project Settings (All Hidden Where Missing)</w:t>
+      </w:r>
+    </w:p>
+    <w:p>
+      <w:r>
+        <w:rPr>
+          <w:b/>
+        </w:rPr>
+        <w:t xml:space="preserve">Goal: </w:t>
+      </w:r>
+      <w:r>
+        <w:t>Close the remaining gaps noted in the review. The issues list view and create were already gated, but per-issue actions still showed. The task detail popup helpers exist but save, delete, move, assign and subtask/comment/attachment edit/delete still only check isOrgAdmin. Teams, project members and project settings are still ungated. This phase hides every remaining button where its key is missing, using the same single hasPermissionSync with PermissionKeys and isOrgAdmin/isSuperAdmin bypass first, and simply hides the button with no View only badge.</w:t>
+      </w:r>
+    </w:p>
+    <w:p>
+      <w:pPr>
+        <w:pStyle w:val="Heading2"/>
+      </w:pPr>
+      <w:r>
+        <w:t>Task 16.1: Issues Page — Per-Issue Update, Delete, Move and Assign Still Show</w:t>
+      </w:r>
+    </w:p>
+    <w:p>
+      <w:r>
+        <w:rPr>
+          <w:b/>
+        </w:rPr>
+        <w:t xml:space="preserve">Objective: </w:t>
+      </w:r>
+      <w:r>
+        <w:t>The whole issues list and the Create Issue button are now gated, but each row still shows edit, delete, move and assign. Hide those per-issue actions where the specific key is missing.</w:t>
+      </w:r>
+    </w:p>
+    <w:p>
+      <w:r>
+        <w:rPr>
+          <w:b/>
+        </w:rPr>
+        <w:t xml:space="preserve">Key Actions: </w:t>
+      </w:r>
+      <w:r>
+        <w:t>Screens: Issues list page. Buttons per row: Edit issue hidden when task:update missing, Delete issue hidden when task:delete missing, Move between columns or drag disabled when task:move missing, Assignee picker hidden when task:assign missing. Also ensure the row itself stays visible if task:view is present, otherwise the whole row is hidden. Hide, no badge.</w:t>
+      </w:r>
+    </w:p>
+    <w:p>
+      <w:r>
+        <w:rPr>
+          <w:b/>
+        </w:rPr>
+        <w:t xml:space="preserve">Screens &amp; Buttons: </w:t>
+      </w:r>
+      <w:r>
+        <w:t>Issues table rows, row dropdown, move menu, assignee select</w:t>
+      </w:r>
+    </w:p>
+    <w:p>
+      <w:r>
+        <w:rPr>
+          <w:b/>
+        </w:rPr>
+        <w:t xml:space="preserve">Exit Criteria: </w:t>
+      </w:r>
+      <w:r>
+        <w:t>Viewer with only task:view sees rows but no edit, delete, move or assign controls.</w:t>
+      </w:r>
+    </w:p>
+    <w:p>
+      <w:r>
+        <w:rPr>
+          <w:b/>
+        </w:rPr>
+        <w:t xml:space="preserve">Hours: </w:t>
+      </w:r>
+      <w:r>
+        <w:t>0.5h</w:t>
+      </w:r>
+    </w:p>
+    <w:p>
+      <w:r>
+        <w:rPr>
+          <w:b/>
+        </w:rPr>
+        <w:t xml:space="preserve">Dependencies: </w:t>
+      </w:r>
+      <w:r>
+        <w:t>Previous task in this phase</w:t>
+      </w:r>
+    </w:p>
+    <w:p>
+      <w:r>
+        <w:rPr>
+          <w:b/>
+        </w:rPr>
+        <w:t xml:space="preserve">Permission Map: </w:t>
+      </w:r>
+      <w:r>
+        <w:t>All keys</w:t>
+      </w:r>
+    </w:p>
+    <w:p>
+      <w:pPr>
+        <w:pStyle w:val="Heading2"/>
+      </w:pPr>
+      <w:r>
+        <w:t>Task 16.2: Task Detail Popup — Save Changes and Delete Issue</w:t>
+      </w:r>
+    </w:p>
+    <w:p>
+      <w:r>
+        <w:rPr>
+          <w:b/>
+        </w:rPr>
+        <w:t xml:space="preserve">Objective: </w:t>
+      </w:r>
+      <w:r>
+        <w:t>The popup helpers for comments and attachments are in place, but the main Save and Delete issue actions still only check isOrgAdmin. Gate them with the specific keys.</w:t>
+      </w:r>
+    </w:p>
+    <w:p>
+      <w:r>
+        <w:rPr>
+          <w:b/>
+        </w:rPr>
+        <w:t xml:space="preserve">Key Actions: </w:t>
+      </w:r>
+      <w:r>
+        <w:t>Screens: Task detail modal main form. Buttons: Save Changes disabled when task:update missing, Delete Issue hidden when task:delete missing. Hide for delete, disable with tooltip for save where the form stays visible. No View only text.</w:t>
+      </w:r>
+    </w:p>
+    <w:p>
+      <w:r>
+        <w:rPr>
+          <w:b/>
+        </w:rPr>
+        <w:t xml:space="preserve">Screens &amp; Buttons: </w:t>
+      </w:r>
+      <w:r>
+        <w:t>Task detail modal footer Save, header Delete, form fields disabled state</w:t>
+      </w:r>
+    </w:p>
+    <w:p>
+      <w:r>
+        <w:rPr>
+          <w:b/>
+        </w:rPr>
+        <w:t xml:space="preserve">Exit Criteria: </w:t>
+      </w:r>
+      <w:r>
+        <w:t>Member without task:update sees Save disabled, without task:delete sees no Delete.</w:t>
+      </w:r>
+    </w:p>
+    <w:p>
+      <w:r>
+        <w:rPr>
+          <w:b/>
+        </w:rPr>
+        <w:t xml:space="preserve">Hours: </w:t>
+      </w:r>
+      <w:r>
+        <w:t>0.5h</w:t>
+      </w:r>
+    </w:p>
+    <w:p>
+      <w:r>
+        <w:rPr>
+          <w:b/>
+        </w:rPr>
+        <w:t xml:space="preserve">Dependencies: </w:t>
+      </w:r>
+      <w:r>
+        <w:t>Previous task in this phase</w:t>
+      </w:r>
+    </w:p>
+    <w:p>
+      <w:r>
+        <w:rPr>
+          <w:b/>
+        </w:rPr>
+        <w:t xml:space="preserve">Permission Map: </w:t>
+      </w:r>
+      <w:r>
+        <w:t>All keys</w:t>
+      </w:r>
+    </w:p>
+    <w:p>
+      <w:pPr>
+        <w:pStyle w:val="Heading2"/>
+      </w:pPr>
+      <w:r>
+        <w:t>Task 16.3: Task Detail Popup — Move Between Columns and Assign Assignee</w:t>
+      </w:r>
+    </w:p>
+    <w:p>
+      <w:r>
+        <w:rPr>
+          <w:b/>
+        </w:rPr>
+        <w:t xml:space="preserve">Objective: </w:t>
+      </w:r>
+      <w:r>
+        <w:t>Move and assign inside the detail popup are still ungated.</w:t>
+      </w:r>
+    </w:p>
+    <w:p>
+      <w:r>
+        <w:rPr>
+          <w:b/>
+        </w:rPr>
+        <w:t xml:space="preserve">Key Actions: </w:t>
+      </w:r>
+      <w:r>
+        <w:t>Screens: Task detail modal move section and assignee picker. Buttons: Move between lists or columns and status picker disabled when task:move missing, Assignee picker and team or sprint selectors hidden when task:assign missing. Hide for assign, disable for move.</w:t>
+      </w:r>
+    </w:p>
+    <w:p>
+      <w:r>
+        <w:rPr>
+          <w:b/>
+        </w:rPr>
+        <w:t xml:space="preserve">Screens &amp; Buttons: </w:t>
+      </w:r>
+      <w:r>
+        <w:t>Move dropdown, status picker, assignee picker, team and sprint selectors</w:t>
+      </w:r>
+    </w:p>
+    <w:p>
+      <w:r>
+        <w:rPr>
+          <w:b/>
+        </w:rPr>
+        <w:t xml:space="preserve">Exit Criteria: </w:t>
+      </w:r>
+      <w:r>
+        <w:t>Without task:move the move dropdown is disabled, without task:assign the assignee picker is hidden.</w:t>
+      </w:r>
+    </w:p>
+    <w:p>
+      <w:r>
+        <w:rPr>
+          <w:b/>
+        </w:rPr>
+        <w:t xml:space="preserve">Hours: </w:t>
+      </w:r>
+      <w:r>
+        <w:t>0.5h</w:t>
+      </w:r>
+    </w:p>
+    <w:p>
+      <w:r>
+        <w:rPr>
+          <w:b/>
+        </w:rPr>
+        <w:t xml:space="preserve">Dependencies: </w:t>
+      </w:r>
+      <w:r>
+        <w:t>Previous task in this phase</w:t>
+      </w:r>
+    </w:p>
+    <w:p>
+      <w:r>
+        <w:rPr>
+          <w:b/>
+        </w:rPr>
+        <w:t xml:space="preserve">Permission Map: </w:t>
+      </w:r>
+      <w:r>
+        <w:t>All keys</w:t>
+      </w:r>
+    </w:p>
+    <w:p>
+      <w:pPr>
+        <w:pStyle w:val="Heading2"/>
+      </w:pPr>
+      <w:r>
+        <w:t>Task 16.4: Task Detail Popup — Subtasks View, Create, Update and Delete</w:t>
+      </w:r>
+    </w:p>
+    <w:p>
+      <w:r>
+        <w:rPr>
+          <w:b/>
+        </w:rPr>
+        <w:t xml:space="preserve">Objective: </w:t>
+      </w:r>
+      <w:r>
+        <w:t>Subtasks have no permission gating yet.</w:t>
+      </w:r>
+    </w:p>
+    <w:p>
+      <w:r>
+        <w:rPr>
+          <w:b/>
+        </w:rPr>
+        <w:t xml:space="preserve">Key Actions: </w:t>
+      </w:r>
+      <w:r>
+        <w:t>Screens: Task detail modal subtasks section. Buttons: Subtasks list hidden when task:view missing? Actually subtasks are part of task:view, Add Subtask hidden when task:create missing? Create subtask should require task:update or task:create, Edit subtask disabled when task:update missing, Delete subtask hidden when task:delete missing, Toggle completed disabled when task:update missing. Hide for create and delete, disable for edit and toggle.</w:t>
+      </w:r>
+    </w:p>
+    <w:p>
+      <w:r>
+        <w:rPr>
+          <w:b/>
+        </w:rPr>
+        <w:t xml:space="preserve">Screens &amp; Buttons: </w:t>
+      </w:r>
+      <w:r>
+        <w:t>Subtasks list, Add Subtask input, per-subtask edit, delete, toggle checkbox</w:t>
+      </w:r>
+    </w:p>
+    <w:p>
+      <w:r>
+        <w:rPr>
+          <w:b/>
+        </w:rPr>
+        <w:t xml:space="preserve">Exit Criteria: </w:t>
+      </w:r>
+      <w:r>
+        <w:t>Viewer sees no Add Subtask, no delete.</w:t>
+      </w:r>
+    </w:p>
+    <w:p>
+      <w:r>
+        <w:rPr>
+          <w:b/>
+        </w:rPr>
+        <w:t xml:space="preserve">Hours: </w:t>
+      </w:r>
+      <w:r>
+        <w:t>0.5h</w:t>
+      </w:r>
+    </w:p>
+    <w:p>
+      <w:r>
+        <w:rPr>
+          <w:b/>
+        </w:rPr>
+        <w:t xml:space="preserve">Dependencies: </w:t>
+      </w:r>
+      <w:r>
+        <w:t>Previous task in this phase</w:t>
+      </w:r>
+    </w:p>
+    <w:p>
+      <w:r>
+        <w:rPr>
+          <w:b/>
+        </w:rPr>
+        <w:t xml:space="preserve">Permission Map: </w:t>
+      </w:r>
+      <w:r>
+        <w:t>All keys</w:t>
+      </w:r>
+    </w:p>
+    <w:p>
+      <w:pPr>
+        <w:pStyle w:val="Heading2"/>
+      </w:pPr>
+      <w:r>
+        <w:t>Task 16.5: Task Detail Popup — Comments View, Create, Edit and Delete</w:t>
+      </w:r>
+    </w:p>
+    <w:p>
+      <w:r>
+        <w:rPr>
+          <w:b/>
+        </w:rPr>
+        <w:t xml:space="preserve">Objective: </w:t>
+      </w:r>
+      <w:r>
+        <w:t>Comments view and create are partially gated via canCommentHere, but edit and delete of any comment still only check isOrgAdmin.</w:t>
+      </w:r>
+    </w:p>
+    <w:p>
+      <w:r>
+        <w:rPr>
+          <w:b/>
+        </w:rPr>
+        <w:t xml:space="preserve">Key Actions: </w:t>
+      </w:r>
+      <w:r>
+        <w:t>Screens: Task detail modal comments tab. Buttons: Comments thread hidden when comment:view missing, Add Comment hidden when comment:create missing, Edit comment disabled when comment:view? Actually edit should require comment:create? For comments, edit and delete should require comment:create or task:update? In spec, edit and delete comment should be author or OrgAdmin, but for custom roles they should require comment:create? Hide Edit and Delete when not author and missing permission. Hide for add, disable for edit, hide for delete.</w:t>
+      </w:r>
+    </w:p>
+    <w:p>
+      <w:r>
+        <w:rPr>
+          <w:b/>
+        </w:rPr>
+        <w:t xml:space="preserve">Screens &amp; Buttons: </w:t>
+      </w:r>
+      <w:r>
+        <w:t>Comments tab, comment list, Add Comment input per-comment edit and delete</w:t>
+      </w:r>
+    </w:p>
+    <w:p>
+      <w:r>
+        <w:rPr>
+          <w:b/>
+        </w:rPr>
+        <w:t xml:space="preserve">Exit Criteria: </w:t>
+      </w:r>
+      <w:r>
+        <w:t>Without comment:view no thread, without comment:create no Add Comment box.</w:t>
+      </w:r>
+    </w:p>
+    <w:p>
+      <w:r>
+        <w:rPr>
+          <w:b/>
+        </w:rPr>
+        <w:t xml:space="preserve">Hours: </w:t>
+      </w:r>
+      <w:r>
+        <w:t>0.5h</w:t>
+      </w:r>
+    </w:p>
+    <w:p>
+      <w:r>
+        <w:rPr>
+          <w:b/>
+        </w:rPr>
+        <w:t xml:space="preserve">Dependencies: </w:t>
+      </w:r>
+      <w:r>
+        <w:t>Previous task in this phase</w:t>
+      </w:r>
+    </w:p>
+    <w:p>
+      <w:r>
+        <w:rPr>
+          <w:b/>
+        </w:rPr>
+        <w:t xml:space="preserve">Permission Map: </w:t>
+      </w:r>
+      <w:r>
+        <w:t>All keys</w:t>
+      </w:r>
+    </w:p>
+    <w:p>
+      <w:pPr>
+        <w:pStyle w:val="Heading2"/>
+      </w:pPr>
+      <w:r>
+        <w:t>Task 16.6: Task Detail Popup — Attachments View, Create, Update and Delete</w:t>
+      </w:r>
+    </w:p>
+    <w:p>
+      <w:r>
+        <w:rPr>
+          <w:b/>
+        </w:rPr>
+        <w:t xml:space="preserve">Objective: </w:t>
+      </w:r>
+      <w:r>
+        <w:t>Attachments helpers exist but the upload, rename and delete buttons still only check isOrgAdmin.</w:t>
+      </w:r>
+    </w:p>
+    <w:p>
+      <w:r>
+        <w:rPr>
+          <w:b/>
+        </w:rPr>
+        <w:t xml:space="preserve">Key Actions: </w:t>
+      </w:r>
+      <w:r>
+        <w:t>Screens: Task detail modal attachments tab. Buttons: Attachments section hidden when attachment:view missing, Upload hidden when attachment:create missing, Rename disabled when attachment:update missing, Delete hidden when attachment:delete missing. Hide for view, create and delete, disable for rename.</w:t>
+      </w:r>
+    </w:p>
+    <w:p>
+      <w:r>
+        <w:rPr>
+          <w:b/>
+        </w:rPr>
+        <w:t xml:space="preserve">Screens &amp; Buttons: </w:t>
+      </w:r>
+      <w:r>
+        <w:t>Attachments grid, Upload button, per-attachment rename and delete</w:t>
+      </w:r>
+    </w:p>
+    <w:p>
+      <w:r>
+        <w:rPr>
+          <w:b/>
+        </w:rPr>
+        <w:t xml:space="preserve">Exit Criteria: </w:t>
+      </w:r>
+      <w:r>
+        <w:t>Without attachment:view no attachments section at all.</w:t>
+      </w:r>
+    </w:p>
+    <w:p>
+      <w:r>
+        <w:rPr>
+          <w:b/>
+        </w:rPr>
+        <w:t xml:space="preserve">Hours: </w:t>
+      </w:r>
+      <w:r>
+        <w:t>0.5h</w:t>
+      </w:r>
+    </w:p>
+    <w:p>
+      <w:r>
+        <w:rPr>
+          <w:b/>
+        </w:rPr>
+        <w:t xml:space="preserve">Dependencies: </w:t>
+      </w:r>
+      <w:r>
+        <w:t>Previous task in this phase</w:t>
+      </w:r>
+    </w:p>
+    <w:p>
+      <w:r>
+        <w:rPr>
+          <w:b/>
+        </w:rPr>
+        <w:t xml:space="preserve">Permission Map: </w:t>
+      </w:r>
+      <w:r>
+        <w:t>All keys</w:t>
+      </w:r>
+    </w:p>
+    <w:p>
+      <w:pPr>
+        <w:pStyle w:val="Heading2"/>
+      </w:pPr>
+      <w:r>
+        <w:t>Task 16.7: Teams — View Teams, Create Team, Update Team, Delete Team and Inside Team Add Member and Update Member</w:t>
+      </w:r>
+    </w:p>
+    <w:p>
+      <w:r>
+        <w:rPr>
+          <w:b/>
+        </w:rPr>
+        <w:t xml:space="preserve">Objective: </w:t>
+      </w:r>
+      <w:r>
+        <w:t>Backend now has separate team:view, create, update, delete keys, but the frontend teams screens still show for everyone who can see the project.</w:t>
+      </w:r>
+    </w:p>
+    <w:p>
+      <w:r>
+        <w:rPr>
+          <w:b/>
+        </w:rPr>
+        <w:t xml:space="preserve">Key Actions: </w:t>
+      </w:r>
+      <w:r>
+        <w:t>Screens: Teams tab inside project, teams list, team detail. Buttons: Teams tab and list hidden when team:view missing, New Team hidden when team:create missing, Edit team disabled when team:update missing, Delete team hidden when team:delete missing, inside each team Add Member hidden when team:update missing? Actually add member should require team:update, Update member role disabled when team:update missing. Hide for view, create and delete, disable for update and member changes.</w:t>
+      </w:r>
+    </w:p>
+    <w:p>
+      <w:r>
+        <w:rPr>
+          <w:b/>
+        </w:rPr>
+        <w:t xml:space="preserve">Screens &amp; Buttons: </w:t>
+      </w:r>
+      <w:r>
+        <w:t>Teams tab, teams list cards, New Team modal, per-team Edit Delete, team members list Add and Edit</w:t>
+      </w:r>
+    </w:p>
+    <w:p>
+      <w:r>
+        <w:rPr>
+          <w:b/>
+        </w:rPr>
+        <w:t xml:space="preserve">Exit Criteria: </w:t>
+      </w:r>
+      <w:r>
+        <w:t>Member without team:create never sees New Team, without team:view sees no teams tab.</w:t>
+      </w:r>
+    </w:p>
+    <w:p>
+      <w:r>
+        <w:rPr>
+          <w:b/>
+        </w:rPr>
+        <w:t xml:space="preserve">Hours: </w:t>
+      </w:r>
+      <w:r>
+        <w:t>1h</w:t>
+      </w:r>
+    </w:p>
+    <w:p>
+      <w:r>
+        <w:rPr>
+          <w:b/>
+        </w:rPr>
+        <w:t xml:space="preserve">Dependencies: </w:t>
+      </w:r>
+      <w:r>
+        <w:t>Previous task in this phase</w:t>
+      </w:r>
+    </w:p>
+    <w:p>
+      <w:r>
+        <w:rPr>
+          <w:b/>
+        </w:rPr>
+        <w:t xml:space="preserve">Permission Map: </w:t>
+      </w:r>
+      <w:r>
+        <w:t>All keys</w:t>
+      </w:r>
+    </w:p>
+    <w:p>
+      <w:pPr>
+        <w:pStyle w:val="Heading2"/>
+      </w:pPr>
+      <w:r>
+        <w:t>Task 16.8: Project Members — Add Member and Remove Member</w:t>
+      </w:r>
+    </w:p>
+    <w:p>
+      <w:r>
+        <w:rPr>
+          <w:b/>
+        </w:rPr>
+        <w:t xml:space="preserve">Objective: </w:t>
+      </w:r>
+      <w:r>
+        <w:t>Add and remove member for the project itself still only check isOrgAdmin, not a dedicated key. They should be gated by project:update or team:manage style.</w:t>
+      </w:r>
+    </w:p>
+    <w:p>
+      <w:r>
+        <w:rPr>
+          <w:b/>
+        </w:rPr>
+        <w:t xml:space="preserve">Key Actions: </w:t>
+      </w:r>
+      <w:r>
+        <w:t>Screens: Project members tab or members page filtered to project. Buttons: Add Member hidden when project:update missing, Remove Member hidden when project:update missing? Actually remove should require project:update or project:delete? For now map both to project:update. Hide completely when project:update missing. No badge.</w:t>
+      </w:r>
+    </w:p>
+    <w:p>
+      <w:r>
+        <w:rPr>
+          <w:b/>
+        </w:rPr>
+        <w:t xml:space="preserve">Screens &amp; Buttons: </w:t>
+      </w:r>
+      <w:r>
+        <w:t>Project members list, Add Member modal, per-member Remove</w:t>
+      </w:r>
+    </w:p>
+    <w:p>
+      <w:r>
+        <w:rPr>
+          <w:b/>
+        </w:rPr>
+        <w:t xml:space="preserve">Exit Criteria: </w:t>
+      </w:r>
+      <w:r>
+        <w:t>Viewer sees no Add Member button and no Remove icon.</w:t>
+      </w:r>
+    </w:p>
+    <w:p>
+      <w:r>
+        <w:rPr>
+          <w:b/>
+        </w:rPr>
+        <w:t xml:space="preserve">Hours: </w:t>
+      </w:r>
+      <w:r>
+        <w:t>0.5h</w:t>
+      </w:r>
+    </w:p>
+    <w:p>
+      <w:r>
+        <w:rPr>
+          <w:b/>
+        </w:rPr>
+        <w:t xml:space="preserve">Dependencies: </w:t>
+      </w:r>
+      <w:r>
+        <w:t>Previous task in this phase</w:t>
+      </w:r>
+    </w:p>
+    <w:p>
+      <w:r>
+        <w:rPr>
+          <w:b/>
+        </w:rPr>
+        <w:t xml:space="preserve">Permission Map: </w:t>
+      </w:r>
+      <w:r>
+        <w:t>All keys</w:t>
+      </w:r>
+    </w:p>
+    <w:p>
+      <w:pPr>
+        <w:pStyle w:val="Heading2"/>
+      </w:pPr>
+      <w:r>
+        <w:t>Task 16.9: Project Settings Page — Save Changes and Delete Project</w:t>
+      </w:r>
+    </w:p>
+    <w:p>
+      <w:r>
+        <w:rPr>
+          <w:b/>
+        </w:rPr>
+        <w:t xml:space="preserve">Objective: </w:t>
+      </w:r>
+      <w:r>
+        <w:t>Save Changes and Delete Project are partially gated on the workspace cards, but the dedicated settings screen where you actually edit the project name and delete the whole project is still only checking isOrgAdmin.</w:t>
+      </w:r>
+    </w:p>
+    <w:p>
+      <w:r>
+        <w:rPr>
+          <w:b/>
+        </w:rPr>
+        <w:t xml:space="preserve">Key Actions: </w:t>
+      </w:r>
+      <w:r>
+        <w:t>Screens: Project Settings page. Buttons: Save Changes disabled when project:update missing, Delete Project hidden when project:delete missing. Also whole settings section hidden when project:view missing. Hide for delete and view, disable for save with tooltip.</w:t>
+      </w:r>
+    </w:p>
+    <w:p>
+      <w:r>
+        <w:rPr>
+          <w:b/>
+        </w:rPr>
+        <w:t xml:space="preserve">Screens &amp; Buttons: </w:t>
+      </w:r>
+      <w:r>
+        <w:t>Project Settings form Save, Delete Project section and confirm modal</w:t>
+      </w:r>
+    </w:p>
+    <w:p>
+      <w:r>
+        <w:rPr>
+          <w:b/>
+        </w:rPr>
+        <w:t xml:space="preserve">Exit Criteria: </w:t>
+      </w:r>
+      <w:r>
+        <w:t>Without project:update Save is disabled, without project:delete no Delete Project section, without project:view no settings at all.</w:t>
+      </w:r>
+    </w:p>
+    <w:p>
+      <w:r>
+        <w:rPr>
+          <w:b/>
+        </w:rPr>
+        <w:t xml:space="preserve">Hours: </w:t>
+      </w:r>
+      <w:r>
+        <w:t>0.5h</w:t>
+      </w:r>
+    </w:p>
+    <w:p>
+      <w:r>
+        <w:rPr>
+          <w:b/>
+        </w:rPr>
+        <w:t xml:space="preserve">Dependencies: </w:t>
+      </w:r>
+      <w:r>
+        <w:t>Previous task in this phase</w:t>
+      </w:r>
+    </w:p>
+    <w:p>
+      <w:r>
+        <w:rPr>
+          <w:b/>
+        </w:rPr>
+        <w:t xml:space="preserve">Permission Map: </w:t>
+      </w:r>
+      <w:r>
+        <w:t>All keys</w:t>
       </w:r>
     </w:p>
     <w:sectPr>

</xml_diff>

<commit_message>
feat: Phase 17 truncate all data except seeding - SuperAdmin settings danger zone with purge API (keeps 47 permissions, plans, flags, superadmins)
</commit_message>
<xml_diff>
--- a/Documents/FlowBoard_Tasks_Plan.docx
+++ b/Documents/FlowBoard_Tasks_Plan.docx
@@ -21121,6 +21121,112 @@
       </w:r>
       <w:r>
         <w:t>All keys</w:t>
+      </w:r>
+    </w:p>
+    <w:p>
+      <w:pPr>
+        <w:pStyle w:val="Heading1"/>
+      </w:pPr>
+      <w:r>
+        <w:t>Phase 17: SuperAdmin Danger Zone - Truncate All Data Except Seeding (7 Tasks)</w:t>
+      </w:r>
+    </w:p>
+    <w:p>
+      <w:pPr>
+        <w:pStyle w:val="Heading2"/>
+      </w:pPr>
+      <w:r>
+        <w:t>Task 17.1: Backend - Truncate Service Logic (Keep Seeding Data)</w:t>
+      </w:r>
+    </w:p>
+    <w:p>
+      <w:pPr/>
+      <w:r>
+        <w:t>Create service that hard deletes all customer data across identity, project, file, notification schemas while keeping Permissions 47, SubscriptionPlans, FeatureFlags, PlatformSettings and IsSuperAdmin users. Handles FK order: child to parent, e.g., comments/subtasks before tasks, board column statuses before boards, attachments/notifications, etc. Keeps migrations history.</w:t>
+      </w:r>
+    </w:p>
+    <w:p>
+      <w:pPr>
+        <w:pStyle w:val="Heading2"/>
+      </w:pPr>
+      <w:r>
+        <w:t>Task 17.2: Backend - Secure SuperAdmin API Endpoint</w:t>
+      </w:r>
+    </w:p>
+    <w:p>
+      <w:pPr/>
+      <w:r>
+        <w:t>Expose POST /api/superadmin/system/purge for superadmin only. Verifies IsSuperAdmin, rate limited, audit logged via Serilog and OrganizationActivity, returns counts of deleted orgs/users/projects. No GET, no client access.</w:t>
+      </w:r>
+    </w:p>
+    <w:p>
+      <w:pPr>
+        <w:pStyle w:val="Heading2"/>
+      </w:pPr>
+      <w:r>
+        <w:t>Task 17.3: Database - Deletion Order and Seed Keep Rules</w:t>
+      </w:r>
+    </w:p>
+    <w:p>
+      <w:pPr/>
+      <w:r>
+        <w:t>Define exact delete order for all tables to avoid FK violations. Keep tables: Permissions, SubscriptionPlans, FeatureFlags, PlatformSettings. Keep rows: Users where IsSuperAdmin=1. Delete all other rows in identity/project/file/notification. Uses DELETE not TRUNCATE for MonsterASP compatibility.</w:t>
+      </w:r>
+    </w:p>
+    <w:p>
+      <w:pPr>
+        <w:pStyle w:val="Heading2"/>
+      </w:pPr>
+      <w:r>
+        <w:t>Task 17.4: Frontend - Settings Danger Zone Section (Last Section)</w:t>
+      </w:r>
+    </w:p>
+    <w:p>
+      <w:pPr/>
+      <w:r>
+        <w:t>Add last section on superadmin settings page as danger zone with red styling, title Truncate All Data, description that it will remove all customer data but keep seeding data, and a red truncate button. Visible only to superadmin, placed after all existing settings sections.</w:t>
+      </w:r>
+    </w:p>
+    <w:p>
+      <w:pPr>
+        <w:pStyle w:val="Heading2"/>
+      </w:pPr>
+      <w:r>
+        <w:t>Task 17.5: Frontend - Double Confirmation Modal (Type TRUNCATE)</w:t>
+      </w:r>
+    </w:p>
+    <w:p>
+      <w:pPr/>
+      <w:r>
+        <w:t>Add confirmation dialog that shows preview counts before delete, requires typing TRUNCATE to enable confirm, shows loading, success and error toasts, and disables button during request. Reuses ConfirmDelete component style.</w:t>
+      </w:r>
+    </w:p>
+    <w:p>
+      <w:pPr>
+        <w:pStyle w:val="Heading2"/>
+      </w:pPr>
+      <w:r>
+        <w:t>Task 17.6: Integration and Safety (Cache and Audit)</w:t>
+      </w:r>
+    </w:p>
+    <w:p>
+      <w:pPr/>
+      <w:r>
+        <w:t>After truncate clear redis cache, invalidate frontend queries, dismiss notices, ensure superadmin can still login and seeding data intact. Add audit log and platform notice. Ensure endpoint disabled when not allowed.</w:t>
+      </w:r>
+    </w:p>
+    <w:p>
+      <w:pPr>
+        <w:pStyle w:val="Heading2"/>
+      </w:pPr>
+      <w:r>
+        <w:t>Task 17.7: Verification End-to-End</w:t>
+      </w:r>
+    </w:p>
+    <w:p>
+      <w:pPr/>
+      <w:r>
+        <w:t>Verify as superadmin that counts go to zero, that seeding permissions/plans/flags remain, that deleted users cannot login, that new org can be created fresh, and that non-superadmin never sees button.</w:t>
       </w:r>
     </w:p>
     <w:sectPr>

</xml_diff>